<commit_message>
Word bank template v3: +6 more SOAs — military super, in-specie super, recontribution, contribution splitting verbatim
Reviewed Trimble, Hewitt, Trenerry, Elston, Holden (16 SOAs total):
- Verbatim (no longer draft): military super (DB portion scoped out), in-specie
  super transfer, recontribution strategy (two accounts + NCC), contribution
  splitting (up to 85% of concessional to spouse).
- Added: SMSF wind-up / in-specie split to personal super on separation.
- Entity finding: the only company across all 16 SOAs is an SMSF CORPORATE
  TRUSTEE ("KENZIE PTY LTD ATF The Trustee for Clooneyfund (SMSF)"); every other
  company/trust reference is generic education and the family trust is always
  scoped out. Noted the corporate-trustee pattern on the SMSF entity row; a true
  bucket/investment-company-as-advice-entity example is still outstanding.

Co-Authored-By: Claude Opus 4.8 <noreply@anthropic.com>
Claude-Session: https://claude.ai/code/session_01CJyTkvXG177amnieSHgEc8
</commit_message>
<xml_diff>
--- a/MWS_SOA_WordBank_Template.docx
+++ b/MWS_SOA_WordBank_Template.docx
@@ -11314,7 +11314,7 @@
               <w:rPr>
                 <w:sz w:val="19"/>
               </w:rPr>
-              <w:t>We recommend transferring your existing superannuation holdings in‑specie into the new fund, with assets that cannot be internally netted sold down as part of the rebalance.</w:t>
+              <w:t>We recommend completing an in-specie transfer of your [SMSF / existing] assets ([Hub24 Investment and MCMA]) into a personal superannuation fund tailored to your needs.</w:t>
             </w:r>
           </w:p>
         </w:tc>
@@ -11345,7 +11345,7 @@
               <w:rPr>
                 <w:sz w:val="19"/>
               </w:rPr>
-              <w:t>An in‑specie transfer retains your holdings while bringing them under professional management, using internal netting to reduce CGT and transaction costs.</w:t>
+              <w:t>An in-specie transfer keeps your portfolio invested while moving it to the recommended fund, saving transaction costs and buy/sell spreads and minimising out-of-market risk.</w:t>
             </w:r>
           </w:p>
         </w:tc>
@@ -11376,7 +11376,9 @@
               <w:rPr>
                 <w:sz w:val="19"/>
               </w:rPr>
-              <w:t>• Retains your holdings while moving to the recommended fund; internal netting reduces transaction costs and CGT.</w:t>
+              <w:t>• An in-specie transfer reduces the need to sell down assets, withdraw funds to your bank account, or re-purchase assets. This saves you on associated transaction costs and buy/sell spreads, and minimises out-of-market risk, ensuring your portfolios remain invested.</w:t>
+              <w:br/>
+              <w:t>• The recommended platform (Hub24) offers the option to in-specie transfer eligible investment options, helping you consolidate your investments into a single platform and streamline ongoing management and administration.</w:t>
             </w:r>
           </w:p>
         </w:tc>
@@ -11407,7 +11409,7 @@
               <w:rPr>
                 <w:sz w:val="19"/>
               </w:rPr>
-              <w:t>• The remaining assets may need to be sold down as part of the rebalance, which may crystallise an estimated capital gain of $XXX and estimated tax liability of approximately $XXX (based on a 15% superannuation tax rate). Commencing pension phase prior to the rebalance may reduce the tax payable — please consult your accountant.</w:t>
+              <w:t>• Assets that are not eligible for in-specie transfer (or that cannot be internally netted) may need to be sold down, which may crystallise capital gains tax — consult your accountant.</w:t>
             </w:r>
           </w:p>
         </w:tc>
@@ -11945,10 +11947,9 @@
           <w:p>
             <w:r>
               <w:rPr>
-                <w:color w:val="B8860B"/>
-                <w:sz w:val="19"/>
-              </w:rPr>
-              <w:t>[Name], we recommend you retain your existing Military Super (Member and Ancillary Benefit portion of $XXX, and the Employer Benefit portion of $XXX which is retained and scoped out) including the insurance arrangements held within this account, while you remain in service.</w:t>
+                <w:sz w:val="19"/>
+              </w:rPr>
+              <w:t>[Name], we recommend you retain your existing Military Super, including the insurance arrangements held within this account, while you remain in service. We have scoped out your Military Super (Defined Benefit portion) from this advice.</w:t>
             </w:r>
           </w:p>
         </w:tc>
@@ -11977,7 +11978,6 @@
           <w:p>
             <w:r>
               <w:rPr>
-                <w:color w:val="B8860B"/>
                 <w:sz w:val="19"/>
               </w:rPr>
               <w:t>Retaining your military super preserves the employer/defined‑benefit entitlement and any insurance, while we manage the balance of your strategy.</w:t>
@@ -12009,10 +12009,9 @@
           <w:p>
             <w:r>
               <w:rPr>
-                <w:color w:val="B8860B"/>
-                <w:sz w:val="19"/>
-              </w:rPr>
-              <w:t>• Preserves the employer/defined‑benefit entitlement and any valuable insurance held in the scheme.</w:t>
+                <w:sz w:val="19"/>
+              </w:rPr>
+              <w:t>• Preserves the employer/defined-benefit entitlement and any valuable insurance held in the scheme.</w:t>
             </w:r>
           </w:p>
         </w:tc>
@@ -12041,10 +12040,9 @@
           <w:p>
             <w:r>
               <w:rPr>
-                <w:color w:val="B8860B"/>
-                <w:sz w:val="19"/>
-              </w:rPr>
-              <w:t>• The employer/defined‑benefit portion is subject to specific scheme rules and preservation requirements which differ from accumulation superannuation and are scoped out of this advice.</w:t>
+                <w:sz w:val="19"/>
+              </w:rPr>
+              <w:t>• We have scoped out your Military Super (Defined Benefit) as these funds are not accessible until a condition of release is met nor can they be rolled over to another fund.</w:t>
             </w:r>
           </w:p>
         </w:tc>
@@ -12073,10 +12071,9 @@
           <w:p>
             <w:r>
               <w:rPr>
-                <w:color w:val="B8860B"/>
-                <w:sz w:val="19"/>
-              </w:rPr>
-              <w:t>• Roll the member &amp; ancillary balance to an accumulation fund — considered where appropriate, but the employer/DB portion must be retained while in service.</w:t>
+                <w:sz w:val="19"/>
+              </w:rPr>
+              <w:t>• Roll the member &amp; ancillary balance to an accumulation fund — the employer/defined-benefit portion must be retained while in service.</w:t>
             </w:r>
           </w:p>
         </w:tc>
@@ -13562,10 +13559,9 @@
           <w:p>
             <w:r>
               <w:rPr>
-                <w:color w:val="B8860B"/>
-                <w:sz w:val="19"/>
-              </w:rPr>
-              <w:t>We recommend you withdraw $XXX from superannuation and recontribute it as a non-concessional contribution to [your / your spouse's] account.</w:t>
+                <w:sz w:val="19"/>
+              </w:rPr>
+              <w:t>We recommend you establish two new superannuation accounts and invest in line with your risk profile. We recommend you make a non-concessional contribution of $XXX into [Account 2] to facilitate the implementation of a recontribution strategy.</w:t>
             </w:r>
           </w:p>
         </w:tc>
@@ -13594,10 +13590,9 @@
           <w:p>
             <w:r>
               <w:rPr>
-                <w:color w:val="B8860B"/>
-                <w:sz w:val="19"/>
-              </w:rPr>
-              <w:t>A recontribution strategy converts a taxable component into a tax-free component, improving the tax treatment of your super death benefit for non-dependant beneficiaries (and can assist with balance equalisation).</w:t>
+                <w:sz w:val="19"/>
+              </w:rPr>
+              <w:t>A recontribution strategy converts a taxable component into a tax-free component, improving the tax treatment of your super death benefit for non-dependant beneficiaries.</w:t>
             </w:r>
           </w:p>
         </w:tc>
@@ -13626,10 +13621,9 @@
           <w:p>
             <w:r>
               <w:rPr>
-                <w:color w:val="B8860B"/>
-                <w:sz w:val="19"/>
-              </w:rPr>
-              <w:t>• Converts a taxable component to a tax-free component, reducing potential death benefits tax for non-dependant beneficiaries.</w:t>
+                <w:sz w:val="19"/>
+              </w:rPr>
+              <w:t>• Converts a taxable component to a tax-free component. A super death benefit paid to a dependant is tax free; if paid to a non-dependant, the tax payable depends on the components that make up the benefit — increasing the tax-free proportion reduces potential death benefits tax.</w:t>
               <w:br/>
               <w:t>• Can be combined with spouse equalisation to make better use of both transfer balance caps.</w:t>
             </w:r>
@@ -13660,10 +13654,9 @@
           <w:p>
             <w:r>
               <w:rPr>
-                <w:color w:val="B8860B"/>
-                <w:sz w:val="19"/>
-              </w:rPr>
-              <w:t>• You must have met a condition of release to withdraw; the recontribution counts toward your non-concessional cap and is preserved; obtain advice on the tax components before implementing.</w:t>
+                <w:sz w:val="19"/>
+              </w:rPr>
+              <w:t>• You must have met a condition of release to withdraw; the recontribution counts toward your non-concessional cap and is preserved. Obtain advice on the tax components before implementing.</w:t>
             </w:r>
           </w:p>
         </w:tc>
@@ -13692,10 +13685,331 @@
           <w:p>
             <w:r>
               <w:rPr>
-                <w:color w:val="B8860B"/>
                 <w:sz w:val="19"/>
               </w:rPr>
               <w:t>• Retain the existing components — discounted where improving the tax-free proportion benefits your beneficiaries.</w:t>
+            </w:r>
+          </w:p>
+        </w:tc>
+      </w:tr>
+    </w:tbl>
+    <w:p/>
+    <w:tbl>
+      <w:tblPr>
+        <w:tblStyle w:val="TableGrid"/>
+        <w:tblW w:type="auto" w:w="0"/>
+        <w:jc w:val="left"/>
+        <w:tblLayout w:type="fixed"/>
+        <w:tblLook w:firstColumn="1" w:firstRow="1" w:lastColumn="0" w:lastRow="0" w:noHBand="0" w:noVBand="1" w:val="04A0"/>
+      </w:tblPr>
+      <w:tblGrid>
+        <w:gridCol w:w="5256"/>
+        <w:gridCol w:w="5256"/>
+      </w:tblGrid>
+      <w:tr>
+        <w:tc>
+          <w:tcPr>
+            <w:tcW w:type="dxa" w:w="10080"/>
+            <w:gridSpan w:val="2"/>
+            <w:shd w:val="clear" w:fill="0C2E3F"/>
+          </w:tcPr>
+          <w:p>
+            <w:r>
+              <w:rPr>
+                <w:b/>
+                <w:color w:val="FFFFFF"/>
+                <w:sz w:val="22"/>
+              </w:rPr>
+              <w:t>● SMSF wind-up / split on separation (in-specie to personal super)</w:t>
+            </w:r>
+          </w:p>
+        </w:tc>
+      </w:tr>
+      <w:tr>
+        <w:tc>
+          <w:tcPr>
+            <w:tcW w:type="dxa" w:w="5256"/>
+            <w:shd w:val="clear" w:fill="E5F4F6"/>
+          </w:tcPr>
+          <w:p>
+            <w:r>
+              <w:rPr>
+                <w:b/>
+                <w:color w:val="0C2E3F"/>
+                <w:sz w:val="17"/>
+              </w:rPr>
+              <w:t>Trigger phrases (how it's written in the advice request)</w:t>
+            </w:r>
+          </w:p>
+        </w:tc>
+        <w:tc>
+          <w:tcPr>
+            <w:tcW w:type="dxa" w:w="5256"/>
+          </w:tcPr>
+          <w:p>
+            <w:r>
+              <w:rPr>
+                <w:sz w:val="19"/>
+              </w:rPr>
+              <w:t>• separation</w:t>
+              <w:br/>
+              <w:t>• relationship breakdown</w:t>
+              <w:br/>
+              <w:t>• wind up smsf</w:t>
+              <w:br/>
+              <w:t>• split smsf assets</w:t>
+            </w:r>
+          </w:p>
+        </w:tc>
+      </w:tr>
+      <w:tr>
+        <w:tc>
+          <w:tcPr>
+            <w:tcW w:type="dxa" w:w="5256"/>
+            <w:shd w:val="clear" w:fill="E5F4F6"/>
+          </w:tcPr>
+          <w:p>
+            <w:r>
+              <w:rPr>
+                <w:b/>
+                <w:color w:val="0C2E3F"/>
+                <w:sz w:val="17"/>
+              </w:rPr>
+              <w:t>Always-on / Tailored</w:t>
+            </w:r>
+          </w:p>
+        </w:tc>
+        <w:tc>
+          <w:tcPr>
+            <w:tcW w:type="dxa" w:w="5256"/>
+          </w:tcPr>
+          <w:p>
+            <w:r>
+              <w:rPr>
+                <w:sz w:val="19"/>
+              </w:rPr>
+              <w:t>Tailored</w:t>
+            </w:r>
+          </w:p>
+        </w:tc>
+      </w:tr>
+      <w:tr>
+        <w:tc>
+          <w:tcPr>
+            <w:tcW w:type="dxa" w:w="5256"/>
+            <w:shd w:val="clear" w:fill="E5F4F6"/>
+          </w:tcPr>
+          <w:p>
+            <w:r>
+              <w:rPr>
+                <w:b/>
+                <w:color w:val="0C2E3F"/>
+                <w:sz w:val="17"/>
+              </w:rPr>
+              <w:t>Scope gate (only show if…)</w:t>
+            </w:r>
+          </w:p>
+        </w:tc>
+        <w:tc>
+          <w:tcPr>
+            <w:tcW w:type="dxa" w:w="5256"/>
+          </w:tcPr>
+          <w:p>
+            <w:r>
+              <w:rPr>
+                <w:sz w:val="19"/>
+              </w:rPr>
+              <w:t>SMSF + separation</w:t>
+            </w:r>
+          </w:p>
+        </w:tc>
+      </w:tr>
+      <w:tr>
+        <w:tc>
+          <w:tcPr>
+            <w:tcW w:type="dxa" w:w="5256"/>
+            <w:shd w:val="clear" w:fill="E5F4F6"/>
+          </w:tcPr>
+          <w:p>
+            <w:r>
+              <w:rPr>
+                <w:b/>
+                <w:color w:val="0C2E3F"/>
+                <w:sz w:val="17"/>
+              </w:rPr>
+              <w:t>Figures it pulls ($ / %)</w:t>
+            </w:r>
+          </w:p>
+        </w:tc>
+        <w:tc>
+          <w:tcPr>
+            <w:tcW w:type="dxa" w:w="5256"/>
+          </w:tcPr>
+          <w:p>
+            <w:r>
+              <w:rPr>
+                <w:sz w:val="19"/>
+              </w:rPr>
+              <w:t>—</w:t>
+            </w:r>
+          </w:p>
+        </w:tc>
+      </w:tr>
+      <w:tr>
+        <w:tc>
+          <w:tcPr>
+            <w:tcW w:type="dxa" w:w="5256"/>
+            <w:shd w:val="clear" w:fill="E5F4F6"/>
+          </w:tcPr>
+          <w:p>
+            <w:r>
+              <w:rPr>
+                <w:b/>
+                <w:color w:val="0C2E3F"/>
+                <w:sz w:val="17"/>
+              </w:rPr>
+              <w:t>Summary – Strategies line</w:t>
+            </w:r>
+          </w:p>
+        </w:tc>
+        <w:tc>
+          <w:tcPr>
+            <w:tcW w:type="dxa" w:w="5256"/>
+          </w:tcPr>
+          <w:p>
+            <w:r>
+              <w:rPr>
+                <w:sz w:val="19"/>
+              </w:rPr>
+              <w:t>Following your separation, we recommend completing an in-specie transfer of your allocated SMSF assets into a personal superannuation fund tailored to your needs.</w:t>
+            </w:r>
+          </w:p>
+        </w:tc>
+      </w:tr>
+      <w:tr>
+        <w:tc>
+          <w:tcPr>
+            <w:tcW w:type="dxa" w:w="5256"/>
+            <w:shd w:val="clear" w:fill="E5F4F6"/>
+          </w:tcPr>
+          <w:p>
+            <w:r>
+              <w:rPr>
+                <w:b/>
+                <w:color w:val="0C2E3F"/>
+                <w:sz w:val="17"/>
+              </w:rPr>
+              <w:t>Summary – Outcomes line</w:t>
+            </w:r>
+          </w:p>
+        </w:tc>
+        <w:tc>
+          <w:tcPr>
+            <w:tcW w:type="dxa" w:w="5256"/>
+          </w:tcPr>
+          <w:p>
+            <w:r>
+              <w:rPr>
+                <w:sz w:val="19"/>
+              </w:rPr>
+              <w:t>Moving your allocated SMSF assets in-specie to a personal fund keeps them invested while removing the ongoing trustee obligations of the SMSF following separation.</w:t>
+            </w:r>
+          </w:p>
+        </w:tc>
+      </w:tr>
+      <w:tr>
+        <w:tc>
+          <w:tcPr>
+            <w:tcW w:type="dxa" w:w="5256"/>
+            <w:shd w:val="clear" w:fill="E5F4F6"/>
+          </w:tcPr>
+          <w:p>
+            <w:r>
+              <w:rPr>
+                <w:b/>
+                <w:color w:val="0C2E3F"/>
+                <w:sz w:val="17"/>
+              </w:rPr>
+              <w:t>Why / In line with your goals (bullets)</w:t>
+            </w:r>
+          </w:p>
+        </w:tc>
+        <w:tc>
+          <w:tcPr>
+            <w:tcW w:type="dxa" w:w="5256"/>
+          </w:tcPr>
+          <w:p>
+            <w:r>
+              <w:rPr>
+                <w:sz w:val="19"/>
+              </w:rPr>
+              <w:t>• Keeps your share of the assets invested while transferring them out of the SMSF, avoiding sell-down costs and out-of-market risk.</w:t>
+              <w:br/>
+              <w:t>• Removes the ongoing administration, audit and trustee compliance obligations of maintaining the SMSF after separation.</w:t>
+            </w:r>
+          </w:p>
+        </w:tc>
+      </w:tr>
+      <w:tr>
+        <w:tc>
+          <w:tcPr>
+            <w:tcW w:type="dxa" w:w="5256"/>
+            <w:shd w:val="clear" w:fill="E5F4F6"/>
+          </w:tcPr>
+          <w:p>
+            <w:r>
+              <w:rPr>
+                <w:b/>
+                <w:color w:val="0C2E3F"/>
+                <w:sz w:val="17"/>
+              </w:rPr>
+              <w:t>Risks &amp; Disadvantages (bullets)</w:t>
+            </w:r>
+          </w:p>
+        </w:tc>
+        <w:tc>
+          <w:tcPr>
+            <w:tcW w:type="dxa" w:w="5256"/>
+          </w:tcPr>
+          <w:p>
+            <w:r>
+              <w:rPr>
+                <w:sz w:val="19"/>
+              </w:rPr>
+              <w:t>• Assets not eligible for in-specie transfer may need to be sold down, which may crystallise CGT.</w:t>
+              <w:br/>
+              <w:t>• SMSF wind-up has its own administrative and compliance steps; consult your accountant/SMSF administrator.</w:t>
+            </w:r>
+          </w:p>
+        </w:tc>
+      </w:tr>
+      <w:tr>
+        <w:tc>
+          <w:tcPr>
+            <w:tcW w:type="dxa" w:w="5256"/>
+            <w:shd w:val="clear" w:fill="E5F4F6"/>
+          </w:tcPr>
+          <w:p>
+            <w:r>
+              <w:rPr>
+                <w:b/>
+                <w:color w:val="0C2E3F"/>
+                <w:sz w:val="17"/>
+              </w:rPr>
+              <w:t>Alternatives (bullets)</w:t>
+            </w:r>
+          </w:p>
+        </w:tc>
+        <w:tc>
+          <w:tcPr>
+            <w:tcW w:type="dxa" w:w="5256"/>
+          </w:tcPr>
+          <w:p>
+            <w:r>
+              <w:rPr>
+                <w:sz w:val="19"/>
+              </w:rPr>
+              <w:t>• Retain the SMSF — discounted where, following separation, the cost and complexity of the SMSF is no longer appropriate.</w:t>
             </w:r>
           </w:p>
         </w:tc>
@@ -15817,10 +16131,9 @@
           <w:p>
             <w:r>
               <w:rPr>
-                <w:color w:val="B8860B"/>
-                <w:sz w:val="19"/>
-              </w:rPr>
-              <w:t>We recommend you split up to 85% of your concessional contributions of $XXX to [Spouse]'s superannuation account.</w:t>
+                <w:sz w:val="19"/>
+              </w:rPr>
+              <w:t>[Name], we recommend you split up to 85% of your concessional (employer and personal tax-deductible) contributions of $XXX to [Spouse]'s super account.</w:t>
             </w:r>
           </w:p>
         </w:tc>
@@ -15849,10 +16162,9 @@
           <w:p>
             <w:r>
               <w:rPr>
-                <w:color w:val="B8860B"/>
-                <w:sz w:val="19"/>
-              </w:rPr>
-              <w:t>Splitting contributions to your spouse helps equalise balances for cap, pension and Centrelink planning.</w:t>
+                <w:sz w:val="19"/>
+              </w:rPr>
+              <w:t>Contribution splitting equalises your balances and can provide earlier access to super and a reduced tax liability.</w:t>
             </w:r>
           </w:p>
         </w:tc>
@@ -15881,10 +16193,13 @@
           <w:p>
             <w:r>
               <w:rPr>
-                <w:color w:val="B8860B"/>
-                <w:sz w:val="19"/>
-              </w:rPr>
-              <w:t>• Helps equalise super balances between spouses, which can assist with transfer balance cap and age pension planning.</w:t>
+                <w:sz w:val="19"/>
+              </w:rPr>
+              <w:t>• Super contributions splitting generally allows you to split up to 85% of your employer super contributions and personal tax-deductible (concessional) contributions to your spouse's super account, so you can both maximise the benefits of super.</w:t>
+              <w:br/>
+              <w:t>• Splitting contributions to a spouse who will reach age 60 before you may allow you earlier access to your super monies and the tax-free status of super withdrawals for those aged 60 or over.</w:t>
+              <w:br/>
+              <w:t>• Suitable if you have a spouse eligible to receive super contributions, a spouse who will reach 60 before you, or you want to boost your spouse's super savings.</w:t>
             </w:r>
           </w:p>
         </w:tc>
@@ -15913,10 +16228,9 @@
           <w:p>
             <w:r>
               <w:rPr>
-                <w:color w:val="B8860B"/>
-                <w:sz w:val="19"/>
-              </w:rPr>
-              <w:t>• Only the prior year's concessional contributions (up to 85%) can be split; the amount is preserved in the spouse's account.</w:t>
+                <w:sz w:val="19"/>
+              </w:rPr>
+              <w:t>• Not all super funds offer contribution splitting. Super is subject to preservation rules and contributions cannot be accessed until a condition of release is met. When split to your spouse's account they do not count towards your spouse's concessional contributions cap (they count against yours).</w:t>
             </w:r>
           </w:p>
         </w:tc>
@@ -15945,7 +16259,6 @@
           <w:p>
             <w:r>
               <w:rPr>
-                <w:color w:val="B8860B"/>
                 <w:sz w:val="19"/>
               </w:rPr>
               <w:t>• Retain the contributions in your own account — discounted where balance equalisation better meets the goal.</w:t>
@@ -22360,10 +22673,11 @@
           <w:p>
             <w:r>
               <w:rPr>
-                <w:color w:val="B8860B"/>
-                <w:sz w:val="19"/>
-              </w:rPr>
-              <w:t>(See Superannuation › Establish / manage an SMSF for the in-fund wording. This row captures the SMSF as the advice ENTITY — trustees, members and ownership.)</w:t>
+                <w:sz w:val="19"/>
+              </w:rPr>
+              <w:t>(See Superannuation › Establish / manage an SMSF for in-fund wording.) Capture the SMSF entity: corporate trustee (e.g. "[NAME] PTY LTD ATF The Trustee for [Fund] (SMSF)"), members and the assets it owns (e.g. a Hub24 investment account + Macquarie MCMA).</w:t>
+              <w:br/>
+              <w:t>Real pattern seen: "KENZIE PTY LTD ATF The Trustee for Clooneyfund (SMSF)".</w:t>
             </w:r>
           </w:p>
         </w:tc>
@@ -22392,7 +22706,6 @@
           <w:p>
             <w:r>
               <w:rPr>
-                <w:color w:val="B8860B"/>
                 <w:sz w:val="19"/>
               </w:rPr>
               <w:t>—</w:t>
@@ -22424,10 +22737,9 @@
           <w:p>
             <w:r>
               <w:rPr>
-                <w:color w:val="B8860B"/>
-                <w:sz w:val="19"/>
-              </w:rPr>
-              <w:t>• Captures the SMSF entity details (corporate/individual trustees, members) for the cover, signatures and ownership columns.</w:t>
+                <w:sz w:val="19"/>
+              </w:rPr>
+              <w:t>• Captures the SMSF entity details (corporate/individual trustee name, members) for the cover, signatures and the asset ownership column.</w:t>
             </w:r>
           </w:p>
         </w:tc>
@@ -22456,7 +22768,6 @@
           <w:p>
             <w:r>
               <w:rPr>
-                <w:color w:val="B8860B"/>
                 <w:sz w:val="19"/>
               </w:rPr>
             </w:r>
@@ -22487,7 +22798,6 @@
           <w:p>
             <w:r>
               <w:rPr>
-                <w:color w:val="B8860B"/>
                 <w:sz w:val="19"/>
               </w:rPr>
             </w:r>

</xml_diff>

<commit_message>
Word bank v4: add employer-paid/default cover + child cover + premium structure + cancel-cover
Adds insurance scenarios flagged as missing: employer-paid (default/group)
cover retain-or-replace, child cover (with conversion-to-adult feature),
stepped vs level / variable age-stepped premium structure, and cancel-cover-no-
longer-required. 74 scenarios total.

Co-Authored-By: Claude Opus 4.8 <noreply@anthropic.com>
Claude-Session: https://claude.ai/code/session_01CJyTkvXG177amnieSHgEc8
</commit_message>
<xml_diff>
--- a/MWS_SOA_WordBank_Template.docx
+++ b/MWS_SOA_WordBank_Template.docx
@@ -18875,6 +18875,1300 @@
                 <w:sz w:val="19"/>
               </w:rPr>
               <w:t>• Apply for IP with a longer waiting period — discounted as you may not have sufficient funds during the waiting period.</w:t>
+            </w:r>
+          </w:p>
+        </w:tc>
+      </w:tr>
+    </w:tbl>
+    <w:p/>
+    <w:tbl>
+      <w:tblPr>
+        <w:tblStyle w:val="TableGrid"/>
+        <w:tblW w:type="auto" w:w="0"/>
+        <w:jc w:val="left"/>
+        <w:tblLayout w:type="fixed"/>
+        <w:tblLook w:firstColumn="1" w:firstRow="1" w:lastColumn="0" w:lastRow="0" w:noHBand="0" w:noVBand="1" w:val="04A0"/>
+      </w:tblPr>
+      <w:tblGrid>
+        <w:gridCol w:w="5256"/>
+        <w:gridCol w:w="5256"/>
+      </w:tblGrid>
+      <w:tr>
+        <w:tc>
+          <w:tcPr>
+            <w:tcW w:type="dxa" w:w="10080"/>
+            <w:gridSpan w:val="2"/>
+            <w:shd w:val="clear" w:fill="0C2E3F"/>
+          </w:tcPr>
+          <w:p>
+            <w:r>
+              <w:rPr>
+                <w:b/>
+                <w:color w:val="FFFFFF"/>
+                <w:sz w:val="22"/>
+              </w:rPr>
+              <w:t>● Employer-paid / default cover (retain or note)</w:t>
+            </w:r>
+          </w:p>
+        </w:tc>
+      </w:tr>
+      <w:tr>
+        <w:tc>
+          <w:tcPr>
+            <w:tcW w:type="dxa" w:w="5256"/>
+            <w:shd w:val="clear" w:fill="E5F4F6"/>
+          </w:tcPr>
+          <w:p>
+            <w:r>
+              <w:rPr>
+                <w:b/>
+                <w:color w:val="0C2E3F"/>
+                <w:sz w:val="17"/>
+              </w:rPr>
+              <w:t>Trigger phrases (how it's written in the advice request)</w:t>
+            </w:r>
+          </w:p>
+        </w:tc>
+        <w:tc>
+          <w:tcPr>
+            <w:tcW w:type="dxa" w:w="5256"/>
+          </w:tcPr>
+          <w:p>
+            <w:r>
+              <w:rPr>
+                <w:sz w:val="19"/>
+              </w:rPr>
+              <w:t>• employer paid cover</w:t>
+              <w:br/>
+              <w:t>• default cover</w:t>
+              <w:br/>
+              <w:t>• automatic acceptance</w:t>
+              <w:br/>
+              <w:t>• group cover within super</w:t>
+            </w:r>
+          </w:p>
+        </w:tc>
+      </w:tr>
+      <w:tr>
+        <w:tc>
+          <w:tcPr>
+            <w:tcW w:type="dxa" w:w="5256"/>
+            <w:shd w:val="clear" w:fill="E5F4F6"/>
+          </w:tcPr>
+          <w:p>
+            <w:r>
+              <w:rPr>
+                <w:b/>
+                <w:color w:val="0C2E3F"/>
+                <w:sz w:val="17"/>
+              </w:rPr>
+              <w:t>Always-on / Tailored</w:t>
+            </w:r>
+          </w:p>
+        </w:tc>
+        <w:tc>
+          <w:tcPr>
+            <w:tcW w:type="dxa" w:w="5256"/>
+          </w:tcPr>
+          <w:p>
+            <w:r>
+              <w:rPr>
+                <w:sz w:val="19"/>
+              </w:rPr>
+              <w:t>Tailored</w:t>
+            </w:r>
+          </w:p>
+        </w:tc>
+      </w:tr>
+      <w:tr>
+        <w:tc>
+          <w:tcPr>
+            <w:tcW w:type="dxa" w:w="5256"/>
+            <w:shd w:val="clear" w:fill="E5F4F6"/>
+          </w:tcPr>
+          <w:p>
+            <w:r>
+              <w:rPr>
+                <w:b/>
+                <w:color w:val="0C2E3F"/>
+                <w:sz w:val="17"/>
+              </w:rPr>
+              <w:t>Scope gate (only show if…)</w:t>
+            </w:r>
+          </w:p>
+        </w:tc>
+        <w:tc>
+          <w:tcPr>
+            <w:tcW w:type="dxa" w:w="5256"/>
+          </w:tcPr>
+          <w:p>
+            <w:r>
+              <w:rPr>
+                <w:sz w:val="19"/>
+              </w:rPr>
+              <w:t>Existing default/employer cover present</w:t>
+            </w:r>
+          </w:p>
+        </w:tc>
+      </w:tr>
+      <w:tr>
+        <w:tc>
+          <w:tcPr>
+            <w:tcW w:type="dxa" w:w="5256"/>
+            <w:shd w:val="clear" w:fill="E5F4F6"/>
+          </w:tcPr>
+          <w:p>
+            <w:r>
+              <w:rPr>
+                <w:b/>
+                <w:color w:val="0C2E3F"/>
+                <w:sz w:val="17"/>
+              </w:rPr>
+              <w:t>Figures it pulls ($ / %)</w:t>
+            </w:r>
+          </w:p>
+        </w:tc>
+        <w:tc>
+          <w:tcPr>
+            <w:tcW w:type="dxa" w:w="5256"/>
+          </w:tcPr>
+          <w:p>
+            <w:r>
+              <w:rPr>
+                <w:sz w:val="19"/>
+              </w:rPr>
+              <w:t>—</w:t>
+            </w:r>
+          </w:p>
+        </w:tc>
+      </w:tr>
+      <w:tr>
+        <w:tc>
+          <w:tcPr>
+            <w:tcW w:type="dxa" w:w="5256"/>
+            <w:shd w:val="clear" w:fill="E5F4F6"/>
+          </w:tcPr>
+          <w:p>
+            <w:r>
+              <w:rPr>
+                <w:b/>
+                <w:color w:val="0C2E3F"/>
+                <w:sz w:val="17"/>
+              </w:rPr>
+              <w:t>Summary – Strategies line</w:t>
+            </w:r>
+          </w:p>
+        </w:tc>
+        <w:tc>
+          <w:tcPr>
+            <w:tcW w:type="dxa" w:w="5256"/>
+          </w:tcPr>
+          <w:p>
+            <w:r>
+              <w:rPr>
+                <w:color w:val="B8860B"/>
+                <w:sz w:val="19"/>
+              </w:rPr>
+              <w:t>We recommend you retain your existing employer-paid (default) insurance cover of [amounts] held within [Fund], in addition to the recommended cover. (Or, where being replaced: we recommend you cancel your default cover within [Fund] once the new underwritten cover is in force.)</w:t>
+            </w:r>
+          </w:p>
+        </w:tc>
+      </w:tr>
+      <w:tr>
+        <w:tc>
+          <w:tcPr>
+            <w:tcW w:type="dxa" w:w="5256"/>
+            <w:shd w:val="clear" w:fill="E5F4F6"/>
+          </w:tcPr>
+          <w:p>
+            <w:r>
+              <w:rPr>
+                <w:b/>
+                <w:color w:val="0C2E3F"/>
+                <w:sz w:val="17"/>
+              </w:rPr>
+              <w:t>Summary – Outcomes line</w:t>
+            </w:r>
+          </w:p>
+        </w:tc>
+        <w:tc>
+          <w:tcPr>
+            <w:tcW w:type="dxa" w:w="5256"/>
+          </w:tcPr>
+          <w:p>
+            <w:r>
+              <w:rPr>
+                <w:color w:val="B8860B"/>
+                <w:sz w:val="19"/>
+              </w:rPr>
+              <w:t>Retaining your employer-paid cover maintains valuable cover at no cost to your cashflow while the recommended underwritten cover provides certainty at claim time.</w:t>
+            </w:r>
+          </w:p>
+        </w:tc>
+      </w:tr>
+      <w:tr>
+        <w:tc>
+          <w:tcPr>
+            <w:tcW w:type="dxa" w:w="5256"/>
+            <w:shd w:val="clear" w:fill="E5F4F6"/>
+          </w:tcPr>
+          <w:p>
+            <w:r>
+              <w:rPr>
+                <w:b/>
+                <w:color w:val="0C2E3F"/>
+                <w:sz w:val="17"/>
+              </w:rPr>
+              <w:t>Why / In line with your goals (bullets)</w:t>
+            </w:r>
+          </w:p>
+        </w:tc>
+        <w:tc>
+          <w:tcPr>
+            <w:tcW w:type="dxa" w:w="5256"/>
+          </w:tcPr>
+          <w:p>
+            <w:r>
+              <w:rPr>
+                <w:color w:val="B8860B"/>
+                <w:sz w:val="19"/>
+              </w:rPr>
+              <w:t>• Default cover is provided at no direct cost to you (premiums met by your employer / within the fund) and is generally provided on an automatic-acceptance basis without underwriting.</w:t>
+              <w:br/>
+              <w:t>• Retaining it provides an additional layer of cover alongside the recommended underwritten policy.</w:t>
+            </w:r>
+          </w:p>
+        </w:tc>
+      </w:tr>
+      <w:tr>
+        <w:tc>
+          <w:tcPr>
+            <w:tcW w:type="dxa" w:w="5256"/>
+            <w:shd w:val="clear" w:fill="E5F4F6"/>
+          </w:tcPr>
+          <w:p>
+            <w:r>
+              <w:rPr>
+                <w:b/>
+                <w:color w:val="0C2E3F"/>
+                <w:sz w:val="17"/>
+              </w:rPr>
+              <w:t>Risks &amp; Disadvantages (bullets)</w:t>
+            </w:r>
+          </w:p>
+        </w:tc>
+        <w:tc>
+          <w:tcPr>
+            <w:tcW w:type="dxa" w:w="5256"/>
+          </w:tcPr>
+          <w:p>
+            <w:r>
+              <w:rPr>
+                <w:color w:val="B8860B"/>
+                <w:sz w:val="19"/>
+              </w:rPr>
+              <w:t>• Default/group cover is not underwritten, so at claim time the insurer may assess pre-existing conditions and exclusions, creating uncertainty. Cover usually ceases if you change employer or your account becomes inactive.</w:t>
+              <w:br/>
+              <w:t>• Default cover levels are generic and may not match your actual needs.</w:t>
+            </w:r>
+          </w:p>
+        </w:tc>
+      </w:tr>
+      <w:tr>
+        <w:tc>
+          <w:tcPr>
+            <w:tcW w:type="dxa" w:w="5256"/>
+            <w:shd w:val="clear" w:fill="E5F4F6"/>
+          </w:tcPr>
+          <w:p>
+            <w:r>
+              <w:rPr>
+                <w:b/>
+                <w:color w:val="0C2E3F"/>
+                <w:sz w:val="17"/>
+              </w:rPr>
+              <w:t>Alternatives (bullets)</w:t>
+            </w:r>
+          </w:p>
+        </w:tc>
+        <w:tc>
+          <w:tcPr>
+            <w:tcW w:type="dxa" w:w="5256"/>
+          </w:tcPr>
+          <w:p>
+            <w:r>
+              <w:rPr>
+                <w:color w:val="B8860B"/>
+                <w:sz w:val="19"/>
+              </w:rPr>
+              <w:t>• Cancel the default cover and rely solely on the new underwritten cover — discounted where the default cover provides valuable additional cover at no cashflow cost.</w:t>
+            </w:r>
+          </w:p>
+        </w:tc>
+      </w:tr>
+    </w:tbl>
+    <w:p/>
+    <w:tbl>
+      <w:tblPr>
+        <w:tblStyle w:val="TableGrid"/>
+        <w:tblW w:type="auto" w:w="0"/>
+        <w:jc w:val="left"/>
+        <w:tblLayout w:type="fixed"/>
+        <w:tblLook w:firstColumn="1" w:firstRow="1" w:lastColumn="0" w:lastRow="0" w:noHBand="0" w:noVBand="1" w:val="04A0"/>
+      </w:tblPr>
+      <w:tblGrid>
+        <w:gridCol w:w="5256"/>
+        <w:gridCol w:w="5256"/>
+      </w:tblGrid>
+      <w:tr>
+        <w:tc>
+          <w:tcPr>
+            <w:tcW w:type="dxa" w:w="10080"/>
+            <w:gridSpan w:val="2"/>
+            <w:shd w:val="clear" w:fill="0C2E3F"/>
+          </w:tcPr>
+          <w:p>
+            <w:r>
+              <w:rPr>
+                <w:b/>
+                <w:color w:val="FFFFFF"/>
+                <w:sz w:val="22"/>
+              </w:rPr>
+              <w:t>● Child cover</w:t>
+            </w:r>
+          </w:p>
+        </w:tc>
+      </w:tr>
+      <w:tr>
+        <w:tc>
+          <w:tcPr>
+            <w:tcW w:type="dxa" w:w="5256"/>
+            <w:shd w:val="clear" w:fill="E5F4F6"/>
+          </w:tcPr>
+          <w:p>
+            <w:r>
+              <w:rPr>
+                <w:b/>
+                <w:color w:val="0C2E3F"/>
+                <w:sz w:val="17"/>
+              </w:rPr>
+              <w:t>Trigger phrases (how it's written in the advice request)</w:t>
+            </w:r>
+          </w:p>
+        </w:tc>
+        <w:tc>
+          <w:tcPr>
+            <w:tcW w:type="dxa" w:w="5256"/>
+          </w:tcPr>
+          <w:p>
+            <w:r>
+              <w:rPr>
+                <w:sz w:val="19"/>
+              </w:rPr>
+              <w:t>• child cover</w:t>
+              <w:br/>
+              <w:t>• children's insurance</w:t>
+              <w:br/>
+              <w:t>• child trauma</w:t>
+            </w:r>
+          </w:p>
+        </w:tc>
+      </w:tr>
+      <w:tr>
+        <w:tc>
+          <w:tcPr>
+            <w:tcW w:type="dxa" w:w="5256"/>
+            <w:shd w:val="clear" w:fill="E5F4F6"/>
+          </w:tcPr>
+          <w:p>
+            <w:r>
+              <w:rPr>
+                <w:b/>
+                <w:color w:val="0C2E3F"/>
+                <w:sz w:val="17"/>
+              </w:rPr>
+              <w:t>Always-on / Tailored</w:t>
+            </w:r>
+          </w:p>
+        </w:tc>
+        <w:tc>
+          <w:tcPr>
+            <w:tcW w:type="dxa" w:w="5256"/>
+          </w:tcPr>
+          <w:p>
+            <w:r>
+              <w:rPr>
+                <w:sz w:val="19"/>
+              </w:rPr>
+              <w:t>Tailored</w:t>
+            </w:r>
+          </w:p>
+        </w:tc>
+      </w:tr>
+      <w:tr>
+        <w:tc>
+          <w:tcPr>
+            <w:tcW w:type="dxa" w:w="5256"/>
+            <w:shd w:val="clear" w:fill="E5F4F6"/>
+          </w:tcPr>
+          <w:p>
+            <w:r>
+              <w:rPr>
+                <w:b/>
+                <w:color w:val="0C2E3F"/>
+                <w:sz w:val="17"/>
+              </w:rPr>
+              <w:t>Scope gate (only show if…)</w:t>
+            </w:r>
+          </w:p>
+        </w:tc>
+        <w:tc>
+          <w:tcPr>
+            <w:tcW w:type="dxa" w:w="5256"/>
+          </w:tcPr>
+          <w:p>
+            <w:r>
+              <w:rPr>
+                <w:sz w:val="19"/>
+              </w:rPr>
+              <w:t>Dependent children</w:t>
+            </w:r>
+          </w:p>
+        </w:tc>
+      </w:tr>
+      <w:tr>
+        <w:tc>
+          <w:tcPr>
+            <w:tcW w:type="dxa" w:w="5256"/>
+            <w:shd w:val="clear" w:fill="E5F4F6"/>
+          </w:tcPr>
+          <w:p>
+            <w:r>
+              <w:rPr>
+                <w:b/>
+                <w:color w:val="0C2E3F"/>
+                <w:sz w:val="17"/>
+              </w:rPr>
+              <w:t>Figures it pulls ($ / %)</w:t>
+            </w:r>
+          </w:p>
+        </w:tc>
+        <w:tc>
+          <w:tcPr>
+            <w:tcW w:type="dxa" w:w="5256"/>
+          </w:tcPr>
+          <w:p>
+            <w:r>
+              <w:rPr>
+                <w:sz w:val="19"/>
+              </w:rPr>
+              <w:t>{childSum}</w:t>
+            </w:r>
+          </w:p>
+        </w:tc>
+      </w:tr>
+      <w:tr>
+        <w:tc>
+          <w:tcPr>
+            <w:tcW w:type="dxa" w:w="5256"/>
+            <w:shd w:val="clear" w:fill="E5F4F6"/>
+          </w:tcPr>
+          <w:p>
+            <w:r>
+              <w:rPr>
+                <w:b/>
+                <w:color w:val="0C2E3F"/>
+                <w:sz w:val="17"/>
+              </w:rPr>
+              <w:t>Summary – Strategies line</w:t>
+            </w:r>
+          </w:p>
+        </w:tc>
+        <w:tc>
+          <w:tcPr>
+            <w:tcW w:type="dxa" w:w="5256"/>
+          </w:tcPr>
+          <w:p>
+            <w:r>
+              <w:rPr>
+                <w:color w:val="B8860B"/>
+                <w:sz w:val="19"/>
+              </w:rPr>
+              <w:t>We recommend you take out Child Cover of $XXX for [child/children] under your policy.</w:t>
+            </w:r>
+          </w:p>
+        </w:tc>
+      </w:tr>
+      <w:tr>
+        <w:tc>
+          <w:tcPr>
+            <w:tcW w:type="dxa" w:w="5256"/>
+            <w:shd w:val="clear" w:fill="E5F4F6"/>
+          </w:tcPr>
+          <w:p>
+            <w:r>
+              <w:rPr>
+                <w:b/>
+                <w:color w:val="0C2E3F"/>
+                <w:sz w:val="17"/>
+              </w:rPr>
+              <w:t>Summary – Outcomes line</w:t>
+            </w:r>
+          </w:p>
+        </w:tc>
+        <w:tc>
+          <w:tcPr>
+            <w:tcW w:type="dxa" w:w="5256"/>
+          </w:tcPr>
+          <w:p>
+            <w:r>
+              <w:rPr>
+                <w:color w:val="B8860B"/>
+                <w:sz w:val="19"/>
+              </w:rPr>
+              <w:t>Child Cover provides a lump sum to support your family if a child suffers a defined trauma event, and can later convert to adult cover.</w:t>
+            </w:r>
+          </w:p>
+        </w:tc>
+      </w:tr>
+      <w:tr>
+        <w:tc>
+          <w:tcPr>
+            <w:tcW w:type="dxa" w:w="5256"/>
+            <w:shd w:val="clear" w:fill="E5F4F6"/>
+          </w:tcPr>
+          <w:p>
+            <w:r>
+              <w:rPr>
+                <w:b/>
+                <w:color w:val="0C2E3F"/>
+                <w:sz w:val="17"/>
+              </w:rPr>
+              <w:t>Why / In line with your goals (bullets)</w:t>
+            </w:r>
+          </w:p>
+        </w:tc>
+        <w:tc>
+          <w:tcPr>
+            <w:tcW w:type="dxa" w:w="5256"/>
+          </w:tcPr>
+          <w:p>
+            <w:r>
+              <w:rPr>
+                <w:color w:val="B8860B"/>
+                <w:sz w:val="19"/>
+              </w:rPr>
+              <w:t>• Provides a lump sum on a child's defined trauma event to fund medical costs and time away from work.</w:t>
+              <w:br/>
+              <w:t>• If the insured child meets the eligibility criteria, they may convert the Child Cover to an equivalent adult Life Insurance Plan without reapplying or providing medical evidence.</w:t>
+            </w:r>
+          </w:p>
+        </w:tc>
+      </w:tr>
+      <w:tr>
+        <w:tc>
+          <w:tcPr>
+            <w:tcW w:type="dxa" w:w="5256"/>
+            <w:shd w:val="clear" w:fill="E5F4F6"/>
+          </w:tcPr>
+          <w:p>
+            <w:r>
+              <w:rPr>
+                <w:b/>
+                <w:color w:val="0C2E3F"/>
+                <w:sz w:val="17"/>
+              </w:rPr>
+              <w:t>Risks &amp; Disadvantages (bullets)</w:t>
+            </w:r>
+          </w:p>
+        </w:tc>
+        <w:tc>
+          <w:tcPr>
+            <w:tcW w:type="dxa" w:w="5256"/>
+          </w:tcPr>
+          <w:p>
+            <w:r>
+              <w:rPr>
+                <w:color w:val="B8860B"/>
+                <w:sz w:val="19"/>
+              </w:rPr>
+              <w:t>• Child Cover is limited to defined conditions; some conditions carry a qualifying period.</w:t>
+              <w:br/>
+              <w:t>• Premiums add to the overall policy cost.</w:t>
+            </w:r>
+          </w:p>
+        </w:tc>
+      </w:tr>
+      <w:tr>
+        <w:tc>
+          <w:tcPr>
+            <w:tcW w:type="dxa" w:w="5256"/>
+            <w:shd w:val="clear" w:fill="E5F4F6"/>
+          </w:tcPr>
+          <w:p>
+            <w:r>
+              <w:rPr>
+                <w:b/>
+                <w:color w:val="0C2E3F"/>
+                <w:sz w:val="17"/>
+              </w:rPr>
+              <w:t>Alternatives (bullets)</w:t>
+            </w:r>
+          </w:p>
+        </w:tc>
+        <w:tc>
+          <w:tcPr>
+            <w:tcW w:type="dxa" w:w="5256"/>
+          </w:tcPr>
+          <w:p>
+            <w:r>
+              <w:rPr>
+                <w:color w:val="B8860B"/>
+                <w:sz w:val="19"/>
+              </w:rPr>
+              <w:t>• Self-fund a child's medical/recovery costs — discounted where a lump sum provides more certainty.</w:t>
+            </w:r>
+          </w:p>
+        </w:tc>
+      </w:tr>
+    </w:tbl>
+    <w:p/>
+    <w:tbl>
+      <w:tblPr>
+        <w:tblStyle w:val="TableGrid"/>
+        <w:tblW w:type="auto" w:w="0"/>
+        <w:jc w:val="left"/>
+        <w:tblLayout w:type="fixed"/>
+        <w:tblLook w:firstColumn="1" w:firstRow="1" w:lastColumn="0" w:lastRow="0" w:noHBand="0" w:noVBand="1" w:val="04A0"/>
+      </w:tblPr>
+      <w:tblGrid>
+        <w:gridCol w:w="5256"/>
+        <w:gridCol w:w="5256"/>
+      </w:tblGrid>
+      <w:tr>
+        <w:tc>
+          <w:tcPr>
+            <w:tcW w:type="dxa" w:w="10080"/>
+            <w:gridSpan w:val="2"/>
+            <w:shd w:val="clear" w:fill="0C2E3F"/>
+          </w:tcPr>
+          <w:p>
+            <w:r>
+              <w:rPr>
+                <w:b/>
+                <w:color w:val="FFFFFF"/>
+                <w:sz w:val="22"/>
+              </w:rPr>
+              <w:t>● Premium structure — stepped vs level / variable age-stepped</w:t>
+            </w:r>
+          </w:p>
+        </w:tc>
+      </w:tr>
+      <w:tr>
+        <w:tc>
+          <w:tcPr>
+            <w:tcW w:type="dxa" w:w="5256"/>
+            <w:shd w:val="clear" w:fill="E5F4F6"/>
+          </w:tcPr>
+          <w:p>
+            <w:r>
+              <w:rPr>
+                <w:b/>
+                <w:color w:val="0C2E3F"/>
+                <w:sz w:val="17"/>
+              </w:rPr>
+              <w:t>Trigger phrases (how it's written in the advice request)</w:t>
+            </w:r>
+          </w:p>
+        </w:tc>
+        <w:tc>
+          <w:tcPr>
+            <w:tcW w:type="dxa" w:w="5256"/>
+          </w:tcPr>
+          <w:p>
+            <w:r>
+              <w:rPr>
+                <w:sz w:val="19"/>
+              </w:rPr>
+              <w:t>• stepped premium</w:t>
+              <w:br/>
+              <w:t>• level premium</w:t>
+              <w:br/>
+              <w:t>• variable age-stepped</w:t>
+            </w:r>
+          </w:p>
+        </w:tc>
+      </w:tr>
+      <w:tr>
+        <w:tc>
+          <w:tcPr>
+            <w:tcW w:type="dxa" w:w="5256"/>
+            <w:shd w:val="clear" w:fill="E5F4F6"/>
+          </w:tcPr>
+          <w:p>
+            <w:r>
+              <w:rPr>
+                <w:b/>
+                <w:color w:val="0C2E3F"/>
+                <w:sz w:val="17"/>
+              </w:rPr>
+              <w:t>Always-on / Tailored</w:t>
+            </w:r>
+          </w:p>
+        </w:tc>
+        <w:tc>
+          <w:tcPr>
+            <w:tcW w:type="dxa" w:w="5256"/>
+          </w:tcPr>
+          <w:p>
+            <w:r>
+              <w:rPr>
+                <w:sz w:val="19"/>
+              </w:rPr>
+              <w:t>Always-on (with new cover)</w:t>
+            </w:r>
+          </w:p>
+        </w:tc>
+      </w:tr>
+      <w:tr>
+        <w:tc>
+          <w:tcPr>
+            <w:tcW w:type="dxa" w:w="5256"/>
+            <w:shd w:val="clear" w:fill="E5F4F6"/>
+          </w:tcPr>
+          <w:p>
+            <w:r>
+              <w:rPr>
+                <w:b/>
+                <w:color w:val="0C2E3F"/>
+                <w:sz w:val="17"/>
+              </w:rPr>
+              <w:t>Scope gate (only show if…)</w:t>
+            </w:r>
+          </w:p>
+        </w:tc>
+        <w:tc>
+          <w:tcPr>
+            <w:tcW w:type="dxa" w:w="5256"/>
+          </w:tcPr>
+          <w:p>
+            <w:r>
+              <w:rPr>
+                <w:sz w:val="19"/>
+              </w:rPr>
+              <w:t>—</w:t>
+            </w:r>
+          </w:p>
+        </w:tc>
+      </w:tr>
+      <w:tr>
+        <w:tc>
+          <w:tcPr>
+            <w:tcW w:type="dxa" w:w="5256"/>
+            <w:shd w:val="clear" w:fill="E5F4F6"/>
+          </w:tcPr>
+          <w:p>
+            <w:r>
+              <w:rPr>
+                <w:b/>
+                <w:color w:val="0C2E3F"/>
+                <w:sz w:val="17"/>
+              </w:rPr>
+              <w:t>Figures it pulls ($ / %)</w:t>
+            </w:r>
+          </w:p>
+        </w:tc>
+        <w:tc>
+          <w:tcPr>
+            <w:tcW w:type="dxa" w:w="5256"/>
+          </w:tcPr>
+          <w:p>
+            <w:r>
+              <w:rPr>
+                <w:sz w:val="19"/>
+              </w:rPr>
+              <w:t>—</w:t>
+            </w:r>
+          </w:p>
+        </w:tc>
+      </w:tr>
+      <w:tr>
+        <w:tc>
+          <w:tcPr>
+            <w:tcW w:type="dxa" w:w="5256"/>
+            <w:shd w:val="clear" w:fill="E5F4F6"/>
+          </w:tcPr>
+          <w:p>
+            <w:r>
+              <w:rPr>
+                <w:b/>
+                <w:color w:val="0C2E3F"/>
+                <w:sz w:val="17"/>
+              </w:rPr>
+              <w:t>Summary – Strategies line</w:t>
+            </w:r>
+          </w:p>
+        </w:tc>
+        <w:tc>
+          <w:tcPr>
+            <w:tcW w:type="dxa" w:w="5256"/>
+          </w:tcPr>
+          <w:p>
+            <w:r>
+              <w:rPr>
+                <w:color w:val="B8860B"/>
+                <w:sz w:val="19"/>
+              </w:rPr>
+              <w:t>We recommend a [Variable Age-Stepped / Level] premium structure for all cover.</w:t>
+            </w:r>
+          </w:p>
+        </w:tc>
+      </w:tr>
+      <w:tr>
+        <w:tc>
+          <w:tcPr>
+            <w:tcW w:type="dxa" w:w="5256"/>
+            <w:shd w:val="clear" w:fill="E5F4F6"/>
+          </w:tcPr>
+          <w:p>
+            <w:r>
+              <w:rPr>
+                <w:b/>
+                <w:color w:val="0C2E3F"/>
+                <w:sz w:val="17"/>
+              </w:rPr>
+              <w:t>Summary – Outcomes line</w:t>
+            </w:r>
+          </w:p>
+        </w:tc>
+        <w:tc>
+          <w:tcPr>
+            <w:tcW w:type="dxa" w:w="5256"/>
+          </w:tcPr>
+          <w:p>
+            <w:r>
+              <w:rPr>
+                <w:color w:val="B8860B"/>
+                <w:sz w:val="19"/>
+              </w:rPr>
+              <w:t>The recommended premium structure balances affordability now against the long-term cost of holding the cover.</w:t>
+            </w:r>
+          </w:p>
+        </w:tc>
+      </w:tr>
+      <w:tr>
+        <w:tc>
+          <w:tcPr>
+            <w:tcW w:type="dxa" w:w="5256"/>
+            <w:shd w:val="clear" w:fill="E5F4F6"/>
+          </w:tcPr>
+          <w:p>
+            <w:r>
+              <w:rPr>
+                <w:b/>
+                <w:color w:val="0C2E3F"/>
+                <w:sz w:val="17"/>
+              </w:rPr>
+              <w:t>Why / In line with your goals (bullets)</w:t>
+            </w:r>
+          </w:p>
+        </w:tc>
+        <w:tc>
+          <w:tcPr>
+            <w:tcW w:type="dxa" w:w="5256"/>
+          </w:tcPr>
+          <w:p>
+            <w:r>
+              <w:rPr>
+                <w:color w:val="B8860B"/>
+                <w:sz w:val="19"/>
+              </w:rPr>
+              <w:t>• A variable age-stepped/stepped structure keeps premiums lower in the early years; a level structure costs more initially but is more stable and can be cheaper over the long term if cover is held for many years.</w:t>
+            </w:r>
+          </w:p>
+        </w:tc>
+      </w:tr>
+      <w:tr>
+        <w:tc>
+          <w:tcPr>
+            <w:tcW w:type="dxa" w:w="5256"/>
+            <w:shd w:val="clear" w:fill="E5F4F6"/>
+          </w:tcPr>
+          <w:p>
+            <w:r>
+              <w:rPr>
+                <w:b/>
+                <w:color w:val="0C2E3F"/>
+                <w:sz w:val="17"/>
+              </w:rPr>
+              <w:t>Risks &amp; Disadvantages (bullets)</w:t>
+            </w:r>
+          </w:p>
+        </w:tc>
+        <w:tc>
+          <w:tcPr>
+            <w:tcW w:type="dxa" w:w="5256"/>
+          </w:tcPr>
+          <w:p>
+            <w:r>
+              <w:rPr>
+                <w:color w:val="B8860B"/>
+                <w:sz w:val="19"/>
+              </w:rPr>
+              <w:t>• Stepped premiums increase with age and can become expensive in later years; level premiums are higher initially and you may pay more if you cancel the cover early.</w:t>
+            </w:r>
+          </w:p>
+        </w:tc>
+      </w:tr>
+      <w:tr>
+        <w:tc>
+          <w:tcPr>
+            <w:tcW w:type="dxa" w:w="5256"/>
+            <w:shd w:val="clear" w:fill="E5F4F6"/>
+          </w:tcPr>
+          <w:p>
+            <w:r>
+              <w:rPr>
+                <w:b/>
+                <w:color w:val="0C2E3F"/>
+                <w:sz w:val="17"/>
+              </w:rPr>
+              <w:t>Alternatives (bullets)</w:t>
+            </w:r>
+          </w:p>
+        </w:tc>
+        <w:tc>
+          <w:tcPr>
+            <w:tcW w:type="dxa" w:w="5256"/>
+          </w:tcPr>
+          <w:p>
+            <w:r>
+              <w:rPr>
+                <w:color w:val="B8860B"/>
+                <w:sz w:val="19"/>
+              </w:rPr>
+              <w:t>• The alternative premium structure was considered and discounted based on your expected holding period and affordability.</w:t>
+            </w:r>
+          </w:p>
+        </w:tc>
+      </w:tr>
+    </w:tbl>
+    <w:p/>
+    <w:tbl>
+      <w:tblPr>
+        <w:tblStyle w:val="TableGrid"/>
+        <w:tblW w:type="auto" w:w="0"/>
+        <w:jc w:val="left"/>
+        <w:tblLayout w:type="fixed"/>
+        <w:tblLook w:firstColumn="1" w:firstRow="1" w:lastColumn="0" w:lastRow="0" w:noHBand="0" w:noVBand="1" w:val="04A0"/>
+      </w:tblPr>
+      <w:tblGrid>
+        <w:gridCol w:w="5256"/>
+        <w:gridCol w:w="5256"/>
+      </w:tblGrid>
+      <w:tr>
+        <w:tc>
+          <w:tcPr>
+            <w:tcW w:type="dxa" w:w="10080"/>
+            <w:gridSpan w:val="2"/>
+            <w:shd w:val="clear" w:fill="0C2E3F"/>
+          </w:tcPr>
+          <w:p>
+            <w:r>
+              <w:rPr>
+                <w:b/>
+                <w:color w:val="FFFFFF"/>
+                <w:sz w:val="22"/>
+              </w:rPr>
+              <w:t>● Cancel cover no longer required</w:t>
+            </w:r>
+          </w:p>
+        </w:tc>
+      </w:tr>
+      <w:tr>
+        <w:tc>
+          <w:tcPr>
+            <w:tcW w:type="dxa" w:w="5256"/>
+            <w:shd w:val="clear" w:fill="E5F4F6"/>
+          </w:tcPr>
+          <w:p>
+            <w:r>
+              <w:rPr>
+                <w:b/>
+                <w:color w:val="0C2E3F"/>
+                <w:sz w:val="17"/>
+              </w:rPr>
+              <w:t>Trigger phrases (how it's written in the advice request)</w:t>
+            </w:r>
+          </w:p>
+        </w:tc>
+        <w:tc>
+          <w:tcPr>
+            <w:tcW w:type="dxa" w:w="5256"/>
+          </w:tcPr>
+          <w:p>
+            <w:r>
+              <w:rPr>
+                <w:sz w:val="19"/>
+              </w:rPr>
+              <w:t>• cancel insurance</w:t>
+              <w:br/>
+              <w:t>• reduce cover</w:t>
+              <w:br/>
+              <w:t>• no longer need cover</w:t>
+            </w:r>
+          </w:p>
+        </w:tc>
+      </w:tr>
+      <w:tr>
+        <w:tc>
+          <w:tcPr>
+            <w:tcW w:type="dxa" w:w="5256"/>
+            <w:shd w:val="clear" w:fill="E5F4F6"/>
+          </w:tcPr>
+          <w:p>
+            <w:r>
+              <w:rPr>
+                <w:b/>
+                <w:color w:val="0C2E3F"/>
+                <w:sz w:val="17"/>
+              </w:rPr>
+              <w:t>Always-on / Tailored</w:t>
+            </w:r>
+          </w:p>
+        </w:tc>
+        <w:tc>
+          <w:tcPr>
+            <w:tcW w:type="dxa" w:w="5256"/>
+          </w:tcPr>
+          <w:p>
+            <w:r>
+              <w:rPr>
+                <w:sz w:val="19"/>
+              </w:rPr>
+              <w:t>Tailored</w:t>
+            </w:r>
+          </w:p>
+        </w:tc>
+      </w:tr>
+      <w:tr>
+        <w:tc>
+          <w:tcPr>
+            <w:tcW w:type="dxa" w:w="5256"/>
+            <w:shd w:val="clear" w:fill="E5F4F6"/>
+          </w:tcPr>
+          <w:p>
+            <w:r>
+              <w:rPr>
+                <w:b/>
+                <w:color w:val="0C2E3F"/>
+                <w:sz w:val="17"/>
+              </w:rPr>
+              <w:t>Scope gate (only show if…)</w:t>
+            </w:r>
+          </w:p>
+        </w:tc>
+        <w:tc>
+          <w:tcPr>
+            <w:tcW w:type="dxa" w:w="5256"/>
+          </w:tcPr>
+          <w:p>
+            <w:r>
+              <w:rPr>
+                <w:sz w:val="19"/>
+              </w:rPr>
+              <w:t>Cover exceeds need</w:t>
+            </w:r>
+          </w:p>
+        </w:tc>
+      </w:tr>
+      <w:tr>
+        <w:tc>
+          <w:tcPr>
+            <w:tcW w:type="dxa" w:w="5256"/>
+            <w:shd w:val="clear" w:fill="E5F4F6"/>
+          </w:tcPr>
+          <w:p>
+            <w:r>
+              <w:rPr>
+                <w:b/>
+                <w:color w:val="0C2E3F"/>
+                <w:sz w:val="17"/>
+              </w:rPr>
+              <w:t>Figures it pulls ($ / %)</w:t>
+            </w:r>
+          </w:p>
+        </w:tc>
+        <w:tc>
+          <w:tcPr>
+            <w:tcW w:type="dxa" w:w="5256"/>
+          </w:tcPr>
+          <w:p>
+            <w:r>
+              <w:rPr>
+                <w:sz w:val="19"/>
+              </w:rPr>
+              <w:t>—</w:t>
+            </w:r>
+          </w:p>
+        </w:tc>
+      </w:tr>
+      <w:tr>
+        <w:tc>
+          <w:tcPr>
+            <w:tcW w:type="dxa" w:w="5256"/>
+            <w:shd w:val="clear" w:fill="E5F4F6"/>
+          </w:tcPr>
+          <w:p>
+            <w:r>
+              <w:rPr>
+                <w:b/>
+                <w:color w:val="0C2E3F"/>
+                <w:sz w:val="17"/>
+              </w:rPr>
+              <w:t>Summary – Strategies line</w:t>
+            </w:r>
+          </w:p>
+        </w:tc>
+        <w:tc>
+          <w:tcPr>
+            <w:tcW w:type="dxa" w:w="5256"/>
+          </w:tcPr>
+          <w:p>
+            <w:r>
+              <w:rPr>
+                <w:color w:val="B8860B"/>
+                <w:sz w:val="19"/>
+              </w:rPr>
+              <w:t>We recommend you cancel your existing [cover type] of $XXX as it exceeds your current insurance needs.</w:t>
+            </w:r>
+          </w:p>
+        </w:tc>
+      </w:tr>
+      <w:tr>
+        <w:tc>
+          <w:tcPr>
+            <w:tcW w:type="dxa" w:w="5256"/>
+            <w:shd w:val="clear" w:fill="E5F4F6"/>
+          </w:tcPr>
+          <w:p>
+            <w:r>
+              <w:rPr>
+                <w:b/>
+                <w:color w:val="0C2E3F"/>
+                <w:sz w:val="17"/>
+              </w:rPr>
+              <w:t>Summary – Outcomes line</w:t>
+            </w:r>
+          </w:p>
+        </w:tc>
+        <w:tc>
+          <w:tcPr>
+            <w:tcW w:type="dxa" w:w="5256"/>
+          </w:tcPr>
+          <w:p>
+            <w:r>
+              <w:rPr>
+                <w:color w:val="B8860B"/>
+                <w:sz w:val="19"/>
+              </w:rPr>
+              <w:t>Cancelling cover you no longer need removes an unnecessary premium cost, improving your cashflow.</w:t>
+            </w:r>
+          </w:p>
+        </w:tc>
+      </w:tr>
+      <w:tr>
+        <w:tc>
+          <w:tcPr>
+            <w:tcW w:type="dxa" w:w="5256"/>
+            <w:shd w:val="clear" w:fill="E5F4F6"/>
+          </w:tcPr>
+          <w:p>
+            <w:r>
+              <w:rPr>
+                <w:b/>
+                <w:color w:val="0C2E3F"/>
+                <w:sz w:val="17"/>
+              </w:rPr>
+              <w:t>Why / In line with your goals (bullets)</w:t>
+            </w:r>
+          </w:p>
+        </w:tc>
+        <w:tc>
+          <w:tcPr>
+            <w:tcW w:type="dxa" w:w="5256"/>
+          </w:tcPr>
+          <w:p>
+            <w:r>
+              <w:rPr>
+                <w:color w:val="B8860B"/>
+                <w:sz w:val="19"/>
+              </w:rPr>
+              <w:t>• Reduces premium outlay where your need for cover has reduced (e.g. debts repaid, assets accumulated, children independent).</w:t>
+            </w:r>
+          </w:p>
+        </w:tc>
+      </w:tr>
+      <w:tr>
+        <w:tc>
+          <w:tcPr>
+            <w:tcW w:type="dxa" w:w="5256"/>
+            <w:shd w:val="clear" w:fill="E5F4F6"/>
+          </w:tcPr>
+          <w:p>
+            <w:r>
+              <w:rPr>
+                <w:b/>
+                <w:color w:val="0C2E3F"/>
+                <w:sz w:val="17"/>
+              </w:rPr>
+              <w:t>Risks &amp; Disadvantages (bullets)</w:t>
+            </w:r>
+          </w:p>
+        </w:tc>
+        <w:tc>
+          <w:tcPr>
+            <w:tcW w:type="dxa" w:w="5256"/>
+          </w:tcPr>
+          <w:p>
+            <w:r>
+              <w:rPr>
+                <w:color w:val="B8860B"/>
+                <w:sz w:val="19"/>
+              </w:rPr>
+              <w:t>• Once cancelled you lose the cover immediately; if your circumstances change, new cover would require fresh underwriting and may be more expensive or declined. Do not cancel existing cover until you are certain it is no longer required.</w:t>
+            </w:r>
+          </w:p>
+        </w:tc>
+      </w:tr>
+      <w:tr>
+        <w:tc>
+          <w:tcPr>
+            <w:tcW w:type="dxa" w:w="5256"/>
+            <w:shd w:val="clear" w:fill="E5F4F6"/>
+          </w:tcPr>
+          <w:p>
+            <w:r>
+              <w:rPr>
+                <w:b/>
+                <w:color w:val="0C2E3F"/>
+                <w:sz w:val="17"/>
+              </w:rPr>
+              <w:t>Alternatives (bullets)</w:t>
+            </w:r>
+          </w:p>
+        </w:tc>
+        <w:tc>
+          <w:tcPr>
+            <w:tcW w:type="dxa" w:w="5256"/>
+          </w:tcPr>
+          <w:p>
+            <w:r>
+              <w:rPr>
+                <w:color w:val="B8860B"/>
+                <w:sz w:val="19"/>
+              </w:rPr>
+              <w:t>• Retain the cover — discounted where it clearly exceeds your assessed need and the premium is better directed elsewhere.</w:t>
             </w:r>
           </w:p>
         </w:tc>

</xml_diff>

<commit_message>
Word bank v6: +5 old-branding SOAs — inheritance paydown, military super, DB inbuilt insurance verbatim
Reviewed Fitzpatrick, Bellamy, Landmeter, McKenzie, Kelly (26 SOAs total; CFS
FirstWrap normalised to CFS Edge):
- Verbatim (no longer draft): inheritance applied to home loan + retained in
  offset for renovations (Bellamy); military super employer-benefit scope-out
  (Kelly); UniSuper defined-benefit scope-out with inbuilt Life & IP retained at
  no premium cost (Fitzpatrick).
- Confirmed across 26 SOAs: no company/trust ever appears as the advice client or
  asset owner (only SMSF corporate trustees); investment bond and personal-loan
  consolidation are never actually recommended (mentioned only).

Co-Authored-By: Claude Opus 4.8 <noreply@anthropic.com>
Claude-Session: https://claude.ai/code/session_01CJyTkvXG177amnieSHgEc8
</commit_message>
<xml_diff>
--- a/MWS_SOA_WordBank_Template.docx
+++ b/MWS_SOA_WordBank_Template.docx
@@ -5043,10 +5043,9 @@
           <w:p>
             <w:r>
               <w:rPr>
-                <w:color w:val="B8860B"/>
-                <w:sz w:val="19"/>
-              </w:rPr>
-              <w:t>We recommend you use your inheritance of {amt} to reduce your home loan.</w:t>
+                <w:sz w:val="19"/>
+              </w:rPr>
+              <w:t>We recommend you use $XXX of your anticipated inheritance to pay down your home loan [after your fixed rate has expired], and retain $XXX of your inheritance in your offset account to cover [expected home renovations / an emergency buffer].</w:t>
             </w:r>
           </w:p>
         </w:tc>
@@ -5075,10 +5074,9 @@
           <w:p>
             <w:r>
               <w:rPr>
-                <w:color w:val="B8860B"/>
-                <w:sz w:val="19"/>
-              </w:rPr>
-              <w:t>Applying your inheritance to your home loan reduces non‑deductible debt, lowers your interest cost and releases equity for future investment.</w:t>
+                <w:sz w:val="19"/>
+              </w:rPr>
+              <w:t>Applying your inheritance to your home loan reduces non-deductible debt and interest cost, while retaining a portion in offset keeps funds accessible for planned expenses.</w:t>
             </w:r>
           </w:p>
         </w:tc>
@@ -5107,10 +5105,11 @@
           <w:p>
             <w:r>
               <w:rPr>
-                <w:color w:val="B8860B"/>
-                <w:sz w:val="19"/>
-              </w:rPr>
-              <w:t>• Reduces bad (non‑deductible) debt, improves cashflow and brings forward the date your home loan is repaid.</w:t>
+                <w:sz w:val="19"/>
+              </w:rPr>
+              <w:t>• Reduces bad (non-deductible) debt, improving cashflow and bringing forward the date your home loan is repaid.</w:t>
+              <w:br/>
+              <w:t>• Retaining a portion in the offset keeps funds accessible for planned costs (e.g. renovations) while still reducing home loan interest.</w:t>
             </w:r>
           </w:p>
         </w:tc>
@@ -5139,10 +5138,11 @@
           <w:p>
             <w:r>
               <w:rPr>
-                <w:color w:val="B8860B"/>
-                <w:sz w:val="19"/>
-              </w:rPr>
-              <w:t>• Applying the funds to debt reduces your available liquidity; consider retaining an appropriate cash buffer for emergencies.</w:t>
+                <w:sz w:val="19"/>
+              </w:rPr>
+              <w:t>• Applying funds to debt reduces your available liquidity; retaining an appropriate offset buffer mitigates this.</w:t>
+              <w:br/>
+              <w:t>• If a fixed rate applies, break costs may arise from paying down before the fixed term expires — time the repayment for after the fixed rate expires.</w:t>
             </w:r>
           </w:p>
         </w:tc>
@@ -5171,10 +5171,9 @@
           <w:p>
             <w:r>
               <w:rPr>
-                <w:color w:val="B8860B"/>
-                <w:sz w:val="19"/>
-              </w:rPr>
-              <w:t>• We considered investing the inheritance instead of reducing the home loan. This was not recommended as reducing non‑deductible debt provides a certain, tax‑effective return equal to your home loan interest rate.</w:t>
+                <w:sz w:val="19"/>
+              </w:rPr>
+              <w:t>• Invest the inheritance instead of reducing the home loan — discounted where reducing non-deductible debt provides a certain, tax-effective return equal to your home loan rate.</w:t>
             </w:r>
           </w:p>
         </w:tc>
@@ -12333,9 +12332,9 @@
               <w:rPr>
                 <w:sz w:val="19"/>
               </w:rPr>
-              <w:t>• Preserves the guaranteed/defined benefit entitlement and any valuable insurance held in the scheme.</w:t>
+              <w:t>• Preserves the guaranteed/defined-benefit entitlement and any valuable insurance held in the scheme.</w:t>
               <w:br/>
-              <w:t>• Continuing concessional contributions helps reduce the effect of fees/premiums and provides net tax savings of approximately $XXX p.a.</w:t>
+              <w:t>• Where the DB fund provides inbuilt Life and Income Protection benefits, these are retained as there is no premium cost charged to you for these benefits.</w:t>
             </w:r>
           </w:p>
         </w:tc>
@@ -12366,6 +12365,8 @@
               <w:rPr>
                 <w:sz w:val="19"/>
               </w:rPr>
+              <w:t>• Due to restrictions within the fund (Defined Benefit portion) — and because the benefit is determined by a formula — we are unable to make any changes or provide advice on this; it is scoped out.</w:t>
+              <w:br/>
               <w:t>• Defined benefit entitlements are subject to specific scheme rules, preservation requirements and legislative considerations which differ from accumulation funds.</w:t>
             </w:r>
           </w:p>
@@ -12682,7 +12683,9 @@
               <w:rPr>
                 <w:sz w:val="19"/>
               </w:rPr>
-              <w:t>• We have scoped out your Military Super (Defined Benefit) as these funds are not accessible until a condition of release is met nor can they be rolled over to another fund.</w:t>
+              <w:t>• You are required to retain the defined benefit portion in your existing Military Super fund (Employer Benefit portion) as you are unable to access this until age 55 — it is scoped out of this advice.</w:t>
+              <w:br/>
+              <w:t>• These funds are not accessible until a condition of release is met, nor can they be rolled over to another fund.</w:t>
             </w:r>
           </w:p>
         </w:tc>
@@ -23778,7 +23781,7 @@
           <w:color w:val="5B6B76"/>
           <w:sz w:val="18"/>
         </w:rPr>
-        <w:t>DRAFT — none of the 10 sample SOAs used a company/bucket company/trust as the ADVICE ENTITY (the family trust was always scoped out). Please send an SOA where the entity IS the client so I can replace these with your real wording.</w:t>
+        <w:t>DRAFT — across 26 sample MWS SOAs, NO company/bucket company or family/discretionary trust ever appears as the advice CLIENT or asset owner; the only non-individual entity is an SMSF with a corporate trustee (e.g. 'KENZIE PTY LTD ATF The Trustee for Clooneyfund'). If MWS writes company/trust-as-client SOAs, please send one; otherwise these rows can be filled from your standard wording.</w:t>
       </w:r>
     </w:p>
     <w:tbl>

</xml_diff>

<commit_message>
Word bank v7: investment bond now verbatim (Martinez — Generation Life children's bonds)
Reviewed Clarke, Dobos, Kohleis, Martinez, McKendry (31 SOAs total, FirstWrap
normalised to CFS Edge). The one genuinely new item: Martinez contains a real
investment-bond recommendation (two children's education bonds via Generation
Life - Life Builder, Vanguard Growth, with the 10-year and 125% rules, the
max-30% tax treatment, and a Generation Life vs Australian Unity vs Centuria
comparison). Upgraded the investment-bond row from draft to verbatim.
Confirmed boilerplate (not strategies): divorce (Will-update mention) and
buy/sell (managed-fund spread / fee-table term).

Co-Authored-By: Claude Opus 4.8 <noreply@anthropic.com>
Claude-Session: https://claude.ai/code/session_01CJyTkvXG177amnieSHgEc8
</commit_message>
<xml_diff>
--- a/MWS_SOA_WordBank_Template.docx
+++ b/MWS_SOA_WordBank_Template.docx
@@ -8950,7 +8950,7 @@
               <w:rPr>
                 <w:sz w:val="19"/>
               </w:rPr>
-              <w:t>Investment bond scoped (NOTE: no real recommendation found in 21 sample SOAs — please verify wording)</w:t>
+              <w:t>Investment bond scoped (commonly for children's education / high-income earners)</w:t>
             </w:r>
           </w:p>
         </w:tc>
@@ -9010,10 +9010,13 @@
           <w:p>
             <w:r>
               <w:rPr>
-                <w:color w:val="B8860B"/>
-                <w:sz w:val="19"/>
-              </w:rPr>
-              <w:t>We recommend you establish a new investment bond and invest $XXX initially and $XXX per month, invested in line with your risk profile.</w:t>
+                <w:sz w:val="19"/>
+              </w:rPr>
+              <w:t>We recommend you establish [a new investment bond / two new investment bonds for each of your children] through the Generation Life – Life Builder Investment Bond platform and invest in line with your risk profile.</w:t>
+              <w:br/>
+              <w:t>You will be able to nominate [child/beneficiary] as the beneficiary of this account.</w:t>
+              <w:br/>
+              <w:t>We recommend you invest the funds into the following investment options: [e.g. Vanguard Growth Portfolio – 100%].</w:t>
             </w:r>
           </w:p>
         </w:tc>
@@ -9042,10 +9045,9 @@
           <w:p>
             <w:r>
               <w:rPr>
-                <w:color w:val="B8860B"/>
-                <w:sz w:val="19"/>
-              </w:rPr>
-              <w:t>An investment bond provides a tax‑effective, long‑term investment structure that becomes tax paid after 10 years.</w:t>
+                <w:sz w:val="19"/>
+              </w:rPr>
+              <w:t>An investment bond provides a tax-effective, long-term structure (earnings taxed within the bond at a maximum of 30%, with no tax payable on withdrawals subject to the 10-year rule), ideal for accumulating for your children's future.</w:t>
             </w:r>
           </w:p>
         </w:tc>
@@ -9074,12 +9076,13 @@
           <w:p>
             <w:r>
               <w:rPr>
-                <w:color w:val="B8860B"/>
-                <w:sz w:val="19"/>
-              </w:rPr>
-              <w:t>• Earnings are taxed within the bond at up to 30% (not your marginal rate), and after 10 years withdrawals are tax‑free.</w:t>
+                <w:sz w:val="19"/>
+              </w:rPr>
+              <w:t>• Earnings within the bond are taxed at a maximum of 30% (not your marginal rate), and there is no tax payable on future withdrawals subject to the 10-year rule.</w:t>
               <w:br/>
-              <w:t>• Useful for high‑income earners and for estate/education planning, with no contribution cap (subject to the 125% rule).</w:t>
+              <w:t>• You can nominate your child / beneficiary on the account, making it a tax-effective vehicle to accumulate for their future (e.g. education).</w:t>
+              <w:br/>
+              <w:t>• The recommended index funds aim to track particular market indices — a passive, cost-effective way to gain broad, diversified market exposure, reducing overall risk.</w:t>
             </w:r>
           </w:p>
         </w:tc>
@@ -9108,14 +9111,15 @@
           <w:p>
             <w:r>
               <w:rPr>
-                <w:color w:val="B8860B"/>
-                <w:sz w:val="19"/>
-              </w:rPr>
-              <w:t>• If you withdraw within the first 10 years some of the profits will be assessable, although you receive a 30% tax offset on the assessable amount.</w:t>
+                <w:sz w:val="19"/>
+              </w:rPr>
+              <w:t>• If you withdraw part or all of your investment bond prior to the 10th year, some of the profits will be assessable to you, although you will receive a 30% tax offset equal to the assessable amount.</w:t>
               <w:br/>
-              <w:t>• If you contribute more than 125% of the previous year's contributions, the 10‑year period restarts.</w:t>
+              <w:t>• If you contribute more than 125% of the previous year's contributions, the 10-year period will restart (this applies where, for example, you make no contribution in a year and then later look to make further contributions).</w:t>
               <w:br/>
-              <w:t>• Investment bonds involve investment risk and do not guarantee returns; you may pay a buy/sell spread.</w:t>
+              <w:t>• You may pay a buy/sell spread and switching fees; there are fees and costs associated with using an investment bond.</w:t>
+              <w:br/>
+              <w:t>• Investment bonds involve some investment risk and do not guarantee your returns; values may fall. By investing instead of holding cash you lose capital stability and access to the government deposit guarantee up to $250,000.</w:t>
             </w:r>
           </w:p>
         </w:tc>
@@ -9144,12 +9148,13 @@
           <w:p>
             <w:r>
               <w:rPr>
-                <w:color w:val="B8860B"/>
-                <w:sz w:val="19"/>
-              </w:rPr>
-              <w:t>• Invest via a standard investment account — discounted where the client's marginal tax rate makes the bond's tax structure advantageous.</w:t>
+                <w:sz w:val="19"/>
+              </w:rPr>
+              <w:t>• Hold the funds in cash (a cash management trust or savings account) for your children — discounted as, over the medium to long term, a managed investment provides greater opportunity for capital growth than holding cash.</w:t>
               <w:br/>
-              <w:t>• Contribute to superannuation — discounted where accessibility before preservation age is required.</w:t>
+              <w:t>• Invest via an ordinary investment platform for your children — discounted as you would not receive the same tax benefits (earnings taxed at a maximum of 30% and no tax payable on future withdrawals, subject to the 10-year rule).</w:t>
+              <w:br/>
+              <w:t>• We completed a price comparison between Generation Life, Australian Unity and Centuria investment bonds. Generation Life was the most cost-effective platform.</w:t>
             </w:r>
           </w:p>
         </w:tc>

</xml_diff>

<commit_message>
Word bank v8: +5 SOAs (Jayasundara/Nagarajan/Chitham/King/Jenkins)
Upgraded to verbatim: testamentary trust (triple-corroborated), insurance
premium structure (incl. couple-divergent level vs variable age-stepped),
non-concessional re-contribution + bring-forward. New scenarios:
contributions reserving strategy (double concessional cap pre-67) and
money-on-the-move tactical DCA. 78 scenarios, 59 verbatim / 19 draft.

Co-Authored-By: Claude Opus 4.8 <noreply@anthropic.com>
Claude-Session: https://claude.ai/code/session_01CJyTkvXG177amnieSHgEc8
</commit_message>
<xml_diff>
--- a/MWS_SOA_WordBank_Template.docx
+++ b/MWS_SOA_WordBank_Template.docx
@@ -10448,6 +10448,326 @@
       </w:tr>
     </w:tbl>
     <w:p/>
+    <w:tbl>
+      <w:tblPr>
+        <w:tblStyle w:val="TableGrid"/>
+        <w:tblW w:type="auto" w:w="0"/>
+        <w:jc w:val="left"/>
+        <w:tblLayout w:type="fixed"/>
+        <w:tblLook w:firstColumn="1" w:firstRow="1" w:lastColumn="0" w:lastRow="0" w:noHBand="0" w:noVBand="1" w:val="04A0"/>
+      </w:tblPr>
+      <w:tblGrid>
+        <w:gridCol w:w="5256"/>
+        <w:gridCol w:w="5256"/>
+      </w:tblGrid>
+      <w:tr>
+        <w:tc>
+          <w:tcPr>
+            <w:tcW w:type="dxa" w:w="10080"/>
+            <w:gridSpan w:val="2"/>
+            <w:shd w:val="clear" w:fill="0C2E3F"/>
+          </w:tcPr>
+          <w:p>
+            <w:r>
+              <w:rPr>
+                <w:b/>
+                <w:color w:val="FFFFFF"/>
+                <w:sz w:val="22"/>
+              </w:rPr>
+              <w:t>● Money on the move — tactical dollar-cost averaging acceleration</w:t>
+            </w:r>
+          </w:p>
+        </w:tc>
+      </w:tr>
+      <w:tr>
+        <w:tc>
+          <w:tcPr>
+            <w:tcW w:type="dxa" w:w="5256"/>
+            <w:shd w:val="clear" w:fill="E5F4F6"/>
+          </w:tcPr>
+          <w:p>
+            <w:r>
+              <w:rPr>
+                <w:b/>
+                <w:color w:val="0C2E3F"/>
+                <w:sz w:val="17"/>
+              </w:rPr>
+              <w:t>Trigger phrases (how it's written in the advice request)</w:t>
+            </w:r>
+          </w:p>
+        </w:tc>
+        <w:tc>
+          <w:tcPr>
+            <w:tcW w:type="dxa" w:w="5256"/>
+          </w:tcPr>
+          <w:p>
+            <w:r>
+              <w:rPr>
+                <w:sz w:val="19"/>
+              </w:rPr>
+              <w:t>• money on the move</w:t>
+              <w:br/>
+              <w:t>• accelerate dca</w:t>
+              <w:br/>
+              <w:t>• bring forward dollar cost averaging</w:t>
+              <w:br/>
+              <w:t>• tactical dca</w:t>
+            </w:r>
+          </w:p>
+        </w:tc>
+      </w:tr>
+      <w:tr>
+        <w:tc>
+          <w:tcPr>
+            <w:tcW w:type="dxa" w:w="5256"/>
+            <w:shd w:val="clear" w:fill="E5F4F6"/>
+          </w:tcPr>
+          <w:p>
+            <w:r>
+              <w:rPr>
+                <w:b/>
+                <w:color w:val="0C2E3F"/>
+                <w:sz w:val="17"/>
+              </w:rPr>
+              <w:t>Always-on / Tailored</w:t>
+            </w:r>
+          </w:p>
+        </w:tc>
+        <w:tc>
+          <w:tcPr>
+            <w:tcW w:type="dxa" w:w="5256"/>
+          </w:tcPr>
+          <w:p>
+            <w:r>
+              <w:rPr>
+                <w:sz w:val="19"/>
+              </w:rPr>
+              <w:t>Tailored (overlay on regular investment)</w:t>
+            </w:r>
+          </w:p>
+        </w:tc>
+      </w:tr>
+      <w:tr>
+        <w:tc>
+          <w:tcPr>
+            <w:tcW w:type="dxa" w:w="5256"/>
+            <w:shd w:val="clear" w:fill="E5F4F6"/>
+          </w:tcPr>
+          <w:p>
+            <w:r>
+              <w:rPr>
+                <w:b/>
+                <w:color w:val="0C2E3F"/>
+                <w:sz w:val="17"/>
+              </w:rPr>
+              <w:t>Scope gate (only show if…)</w:t>
+            </w:r>
+          </w:p>
+        </w:tc>
+        <w:tc>
+          <w:tcPr>
+            <w:tcW w:type="dxa" w:w="5256"/>
+          </w:tcPr>
+          <w:p>
+            <w:r>
+              <w:rPr>
+                <w:sz w:val="19"/>
+              </w:rPr>
+              <w:t>Regular investment / DCA scoped</w:t>
+            </w:r>
+          </w:p>
+        </w:tc>
+      </w:tr>
+      <w:tr>
+        <w:tc>
+          <w:tcPr>
+            <w:tcW w:type="dxa" w:w="5256"/>
+            <w:shd w:val="clear" w:fill="E5F4F6"/>
+          </w:tcPr>
+          <w:p>
+            <w:r>
+              <w:rPr>
+                <w:b/>
+                <w:color w:val="0C2E3F"/>
+                <w:sz w:val="17"/>
+              </w:rPr>
+              <w:t>Figures it pulls ($ / %)</w:t>
+            </w:r>
+          </w:p>
+        </w:tc>
+        <w:tc>
+          <w:tcPr>
+            <w:tcW w:type="dxa" w:w="5256"/>
+          </w:tcPr>
+          <w:p>
+            <w:r>
+              <w:rPr>
+                <w:sz w:val="19"/>
+              </w:rPr>
+              <w:t>1 month of DCA brought forward per 5% market drop</w:t>
+            </w:r>
+          </w:p>
+        </w:tc>
+      </w:tr>
+      <w:tr>
+        <w:tc>
+          <w:tcPr>
+            <w:tcW w:type="dxa" w:w="5256"/>
+            <w:shd w:val="clear" w:fill="E5F4F6"/>
+          </w:tcPr>
+          <w:p>
+            <w:r>
+              <w:rPr>
+                <w:b/>
+                <w:color w:val="0C2E3F"/>
+                <w:sz w:val="17"/>
+              </w:rPr>
+              <w:t>Summary – Strategies line</w:t>
+            </w:r>
+          </w:p>
+        </w:tc>
+        <w:tc>
+          <w:tcPr>
+            <w:tcW w:type="dxa" w:w="5256"/>
+          </w:tcPr>
+          <w:p>
+            <w:r>
+              <w:rPr>
+                <w:sz w:val="19"/>
+              </w:rPr>
+              <w:t>As per the money-on-the-move framework, for every 5% drop in the market we may bring forward one month's dollar-cost averaging to ensure your funds are invested as efficiently as possible.</w:t>
+            </w:r>
+          </w:p>
+        </w:tc>
+      </w:tr>
+      <w:tr>
+        <w:tc>
+          <w:tcPr>
+            <w:tcW w:type="dxa" w:w="5256"/>
+            <w:shd w:val="clear" w:fill="E5F4F6"/>
+          </w:tcPr>
+          <w:p>
+            <w:r>
+              <w:rPr>
+                <w:b/>
+                <w:color w:val="0C2E3F"/>
+                <w:sz w:val="17"/>
+              </w:rPr>
+              <w:t>Summary – Outcomes line</w:t>
+            </w:r>
+          </w:p>
+        </w:tc>
+        <w:tc>
+          <w:tcPr>
+            <w:tcW w:type="dxa" w:w="5256"/>
+          </w:tcPr>
+          <w:p>
+            <w:r>
+              <w:rPr>
+                <w:sz w:val="19"/>
+              </w:rPr>
+              <w:t>Capital is deployed faster during market falls, improving the average entry price across your dollar-cost-averaging program.</w:t>
+            </w:r>
+          </w:p>
+        </w:tc>
+      </w:tr>
+      <w:tr>
+        <w:tc>
+          <w:tcPr>
+            <w:tcW w:type="dxa" w:w="5256"/>
+            <w:shd w:val="clear" w:fill="E5F4F6"/>
+          </w:tcPr>
+          <w:p>
+            <w:r>
+              <w:rPr>
+                <w:b/>
+                <w:color w:val="0C2E3F"/>
+                <w:sz w:val="17"/>
+              </w:rPr>
+              <w:t>Why / In line with your goals (bullets)</w:t>
+            </w:r>
+          </w:p>
+        </w:tc>
+        <w:tc>
+          <w:tcPr>
+            <w:tcW w:type="dxa" w:w="5256"/>
+          </w:tcPr>
+          <w:p>
+            <w:r>
+              <w:rPr>
+                <w:sz w:val="19"/>
+              </w:rPr>
+              <w:t>• Bringing forward scheduled investments during market falls allows you to invest at lower prices, improving long-term efficiency of the dollar-cost-averaging approach.</w:t>
+            </w:r>
+          </w:p>
+        </w:tc>
+      </w:tr>
+      <w:tr>
+        <w:tc>
+          <w:tcPr>
+            <w:tcW w:type="dxa" w:w="5256"/>
+            <w:shd w:val="clear" w:fill="E5F4F6"/>
+          </w:tcPr>
+          <w:p>
+            <w:r>
+              <w:rPr>
+                <w:b/>
+                <w:color w:val="0C2E3F"/>
+                <w:sz w:val="17"/>
+              </w:rPr>
+              <w:t>Risks &amp; Disadvantages (bullets)</w:t>
+            </w:r>
+          </w:p>
+        </w:tc>
+        <w:tc>
+          <w:tcPr>
+            <w:tcW w:type="dxa" w:w="5256"/>
+          </w:tcPr>
+          <w:p>
+            <w:r>
+              <w:rPr>
+                <w:sz w:val="19"/>
+              </w:rPr>
+              <w:t>• Markets may fall further after funds are deployed; accelerating investment increases short-term exposure to further declines.</w:t>
+              <w:br/>
+              <w:t>• The framework is a guideline applied at our discretion, not a guarantee of improved returns.</w:t>
+            </w:r>
+          </w:p>
+        </w:tc>
+      </w:tr>
+      <w:tr>
+        <w:tc>
+          <w:tcPr>
+            <w:tcW w:type="dxa" w:w="5256"/>
+            <w:shd w:val="clear" w:fill="E5F4F6"/>
+          </w:tcPr>
+          <w:p>
+            <w:r>
+              <w:rPr>
+                <w:b/>
+                <w:color w:val="0C2E3F"/>
+                <w:sz w:val="17"/>
+              </w:rPr>
+              <w:t>Alternatives (bullets)</w:t>
+            </w:r>
+          </w:p>
+        </w:tc>
+        <w:tc>
+          <w:tcPr>
+            <w:tcW w:type="dxa" w:w="5256"/>
+          </w:tcPr>
+          <w:p>
+            <w:r>
+              <w:rPr>
+                <w:sz w:val="19"/>
+              </w:rPr>
+              <w:t>• Maintain a fixed dollar-cost-averaging schedule regardless of market movements — discounted as it forgoes the opportunity to invest at lower prices during falls.</w:t>
+            </w:r>
+          </w:p>
+        </w:tc>
+      </w:tr>
+    </w:tbl>
+    <w:p/>
     <w:p>
       <w:pPr>
         <w:spacing w:after="120" w:before="200"/>
@@ -15509,10 +15829,9 @@
           <w:p>
             <w:r>
               <w:rPr>
-                <w:color w:val="B8860B"/>
-                <w:sz w:val="19"/>
-              </w:rPr>
-              <w:t>We recommend you make a non-concessional (after-tax) contribution of $XXX to superannuation.</w:t>
+                <w:sz w:val="19"/>
+              </w:rPr>
+              <w:t>This financial year, we recommend withdrawing [$amount] from your existing pension account and re-contributing it as a once-off non-concessional contribution as part of a re-contribution strategy. Next financial year, we recommend utilising the bring-forward rule to make a further non-concessional contribution of up to [$cap].</w:t>
             </w:r>
           </w:p>
         </w:tc>
@@ -15541,10 +15860,9 @@
           <w:p>
             <w:r>
               <w:rPr>
-                <w:color w:val="B8860B"/>
-                <w:sz w:val="19"/>
-              </w:rPr>
-              <w:t>Moving after‑tax savings into super grows them in a low‑tax environment for retirement.</w:t>
+                <w:sz w:val="19"/>
+              </w:rPr>
+              <w:t>Increasing the tax-free proportion of your superannuation reduces potential tax payable on death benefits, particularly for non-tax-dependant beneficiaries such as your adult children.</w:t>
             </w:r>
           </w:p>
         </w:tc>
@@ -15573,12 +15891,13 @@
           <w:p>
             <w:r>
               <w:rPr>
-                <w:color w:val="B8860B"/>
-                <w:sz w:val="19"/>
-              </w:rPr>
-              <w:t>• Boosts your retirement savings in the concessionally taxed super environment.</w:t>
+                <w:sz w:val="19"/>
+              </w:rPr>
+              <w:t>• Your existing pension comprises a taxable and a tax-free component. Withdrawing funds and re-contributing them as non-concessional contributions increases the tax-free proportion of your superannuation over time and improves overall tax efficiency.</w:t>
               <w:br/>
-              <w:t>• Earnings are taxed at up to 15% rather than your marginal rate.</w:t>
+              <w:t>• It is expected to reduce potential tax payable on death benefits, particularly for non-tax-dependant beneficiaries such as adult children.</w:t>
+              <w:br/>
+              <w:t>• The strategy allows for optimal use of your available non-concessional contribution caps, including the bring-forward rule, to enhance long-term outcomes.</w:t>
             </w:r>
           </w:p>
         </w:tc>
@@ -15607,12 +15926,13 @@
           <w:p>
             <w:r>
               <w:rPr>
-                <w:color w:val="B8860B"/>
-                <w:sz w:val="19"/>
-              </w:rPr>
-              <w:t>• Non‑concessional contributions are subject to an annual cap (and eligibility depends on your total super balance); exceeding the cap results in additional tax.</w:t>
+                <w:sz w:val="19"/>
+              </w:rPr>
+              <w:t>• There is a risk that you don't follow or stick with the strategy, particularly at market extremes.</w:t>
               <w:br/>
-              <w:t>• Contributions are preserved until a condition of release is met.</w:t>
+              <w:t>• If you don't communicate changes in your circumstances, goals and objectives to us, your portfolio may no longer be appropriate.</w:t>
+              <w:br/>
+              <w:t>• The underlying investments within super are invested in investment funds. This involves some investment risk and does not guarantee your returns — values may fall from time to time.</w:t>
             </w:r>
           </w:p>
         </w:tc>
@@ -15641,10 +15961,9 @@
           <w:p>
             <w:r>
               <w:rPr>
-                <w:color w:val="B8860B"/>
-                <w:sz w:val="19"/>
-              </w:rPr>
-              <w:t>• Retain the funds outside super — discounted where the concessional tax treatment within super better meets the goal.</w:t>
+                <w:sz w:val="19"/>
+              </w:rPr>
+              <w:t>• Retain your existing pension account with current funds allocation. I discounted this strategy as the existing account has a high taxable component which makes your super less tax-effective as a wealth-transfer tool — compared to the tax-free component, it creates a larger tax liability for beneficiaries.</w:t>
             </w:r>
           </w:p>
         </w:tc>
@@ -17867,6 +18186,326 @@
                 <w:sz w:val="19"/>
               </w:rPr>
               <w:t>• Retain the proceeds outside super — discounted where the concessional super environment better meets your retirement goal.</w:t>
+            </w:r>
+          </w:p>
+        </w:tc>
+      </w:tr>
+    </w:tbl>
+    <w:p/>
+    <w:tbl>
+      <w:tblPr>
+        <w:tblStyle w:val="TableGrid"/>
+        <w:tblW w:type="auto" w:w="0"/>
+        <w:jc w:val="left"/>
+        <w:tblLayout w:type="fixed"/>
+        <w:tblLook w:firstColumn="1" w:firstRow="1" w:lastColumn="0" w:lastRow="0" w:noHBand="0" w:noVBand="1" w:val="04A0"/>
+      </w:tblPr>
+      <w:tblGrid>
+        <w:gridCol w:w="5256"/>
+        <w:gridCol w:w="5256"/>
+      </w:tblGrid>
+      <w:tr>
+        <w:tc>
+          <w:tcPr>
+            <w:tcW w:type="dxa" w:w="10080"/>
+            <w:gridSpan w:val="2"/>
+            <w:shd w:val="clear" w:fill="0C2E3F"/>
+          </w:tcPr>
+          <w:p>
+            <w:r>
+              <w:rPr>
+                <w:b/>
+                <w:color w:val="FFFFFF"/>
+                <w:sz w:val="22"/>
+              </w:rPr>
+              <w:t>● Contributions reserving strategy (double concessional cap before age 67)</w:t>
+            </w:r>
+          </w:p>
+        </w:tc>
+      </w:tr>
+      <w:tr>
+        <w:tc>
+          <w:tcPr>
+            <w:tcW w:type="dxa" w:w="5256"/>
+            <w:shd w:val="clear" w:fill="E5F4F6"/>
+          </w:tcPr>
+          <w:p>
+            <w:r>
+              <w:rPr>
+                <w:b/>
+                <w:color w:val="0C2E3F"/>
+                <w:sz w:val="17"/>
+              </w:rPr>
+              <w:t>Trigger phrases (how it's written in the advice request)</w:t>
+            </w:r>
+          </w:p>
+        </w:tc>
+        <w:tc>
+          <w:tcPr>
+            <w:tcW w:type="dxa" w:w="5256"/>
+          </w:tcPr>
+          <w:p>
+            <w:r>
+              <w:rPr>
+                <w:sz w:val="19"/>
+              </w:rPr>
+              <w:t>• contribution reserving</w:t>
+              <w:br/>
+              <w:t>• contributions reserving</w:t>
+              <w:br/>
+              <w:t>• reserve contribution</w:t>
+              <w:br/>
+              <w:t>• double concessional cap</w:t>
+            </w:r>
+          </w:p>
+        </w:tc>
+      </w:tr>
+      <w:tr>
+        <w:tc>
+          <w:tcPr>
+            <w:tcW w:type="dxa" w:w="5256"/>
+            <w:shd w:val="clear" w:fill="E5F4F6"/>
+          </w:tcPr>
+          <w:p>
+            <w:r>
+              <w:rPr>
+                <w:b/>
+                <w:color w:val="0C2E3F"/>
+                <w:sz w:val="17"/>
+              </w:rPr>
+              <w:t>Always-on / Tailored</w:t>
+            </w:r>
+          </w:p>
+        </w:tc>
+        <w:tc>
+          <w:tcPr>
+            <w:tcW w:type="dxa" w:w="5256"/>
+          </w:tcPr>
+          <w:p>
+            <w:r>
+              <w:rPr>
+                <w:sz w:val="19"/>
+              </w:rPr>
+              <w:t>Tailored</w:t>
+            </w:r>
+          </w:p>
+        </w:tc>
+      </w:tr>
+      <w:tr>
+        <w:tc>
+          <w:tcPr>
+            <w:tcW w:type="dxa" w:w="5256"/>
+            <w:shd w:val="clear" w:fill="E5F4F6"/>
+          </w:tcPr>
+          <w:p>
+            <w:r>
+              <w:rPr>
+                <w:b/>
+                <w:color w:val="0C2E3F"/>
+                <w:sz w:val="17"/>
+              </w:rPr>
+              <w:t>Scope gate (only show if…)</w:t>
+            </w:r>
+          </w:p>
+        </w:tc>
+        <w:tc>
+          <w:tcPr>
+            <w:tcW w:type="dxa" w:w="5256"/>
+          </w:tcPr>
+          <w:p>
+            <w:r>
+              <w:rPr>
+                <w:sz w:val="19"/>
+              </w:rPr>
+              <w:t>Super contributions scoped; client under 67 with capacity</w:t>
+            </w:r>
+          </w:p>
+        </w:tc>
+      </w:tr>
+      <w:tr>
+        <w:tc>
+          <w:tcPr>
+            <w:tcW w:type="dxa" w:w="5256"/>
+            <w:shd w:val="clear" w:fill="E5F4F6"/>
+          </w:tcPr>
+          <w:p>
+            <w:r>
+              <w:rPr>
+                <w:b/>
+                <w:color w:val="0C2E3F"/>
+                <w:sz w:val="17"/>
+              </w:rPr>
+              <w:t>Figures it pulls ($ / %)</w:t>
+            </w:r>
+          </w:p>
+        </w:tc>
+        <w:tc>
+          <w:tcPr>
+            <w:tcW w:type="dxa" w:w="5256"/>
+          </w:tcPr>
+          <w:p>
+            <w:r>
+              <w:rPr>
+                <w:sz w:val="19"/>
+              </w:rPr>
+              <w:t>Concessional cap × 2 (current + next FY)</w:t>
+            </w:r>
+          </w:p>
+        </w:tc>
+      </w:tr>
+      <w:tr>
+        <w:tc>
+          <w:tcPr>
+            <w:tcW w:type="dxa" w:w="5256"/>
+            <w:shd w:val="clear" w:fill="E5F4F6"/>
+          </w:tcPr>
+          <w:p>
+            <w:r>
+              <w:rPr>
+                <w:b/>
+                <w:color w:val="0C2E3F"/>
+                <w:sz w:val="17"/>
+              </w:rPr>
+              <w:t>Summary – Strategies line</w:t>
+            </w:r>
+          </w:p>
+        </w:tc>
+        <w:tc>
+          <w:tcPr>
+            <w:tcW w:type="dxa" w:w="5256"/>
+          </w:tcPr>
+          <w:p>
+            <w:r>
+              <w:rPr>
+                <w:sz w:val="19"/>
+              </w:rPr>
+              <w:t>We recommend implementing a contributions reserving strategy within your SMSF by making concessional contributions totalling [2 × cap] prior to 30 June. The full amount will be contributed and claimed as a tax deduction, with [one cap] in the current financial year and [one cap] in July (next financial year). This allows use of both years' concessional caps before age 67, when work test rules may limit further contributions.</w:t>
+            </w:r>
+          </w:p>
+        </w:tc>
+      </w:tr>
+      <w:tr>
+        <w:tc>
+          <w:tcPr>
+            <w:tcW w:type="dxa" w:w="5256"/>
+            <w:shd w:val="clear" w:fill="E5F4F6"/>
+          </w:tcPr>
+          <w:p>
+            <w:r>
+              <w:rPr>
+                <w:b/>
+                <w:color w:val="0C2E3F"/>
+                <w:sz w:val="17"/>
+              </w:rPr>
+              <w:t>Summary – Outcomes line</w:t>
+            </w:r>
+          </w:p>
+        </w:tc>
+        <w:tc>
+          <w:tcPr>
+            <w:tcW w:type="dxa" w:w="5256"/>
+          </w:tcPr>
+          <w:p>
+            <w:r>
+              <w:rPr>
+                <w:sz w:val="19"/>
+              </w:rPr>
+              <w:t>You bring forward and claim two years' worth of concessional caps in the current financial year, maximising the tax deduction and capital moved into super before the work test applies.</w:t>
+            </w:r>
+          </w:p>
+        </w:tc>
+      </w:tr>
+      <w:tr>
+        <w:tc>
+          <w:tcPr>
+            <w:tcW w:type="dxa" w:w="5256"/>
+            <w:shd w:val="clear" w:fill="E5F4F6"/>
+          </w:tcPr>
+          <w:p>
+            <w:r>
+              <w:rPr>
+                <w:b/>
+                <w:color w:val="0C2E3F"/>
+                <w:sz w:val="17"/>
+              </w:rPr>
+              <w:t>Why / In line with your goals (bullets)</w:t>
+            </w:r>
+          </w:p>
+        </w:tc>
+        <w:tc>
+          <w:tcPr>
+            <w:tcW w:type="dxa" w:w="5256"/>
+          </w:tcPr>
+          <w:p>
+            <w:r>
+              <w:rPr>
+                <w:sz w:val="19"/>
+              </w:rPr>
+              <w:t>• By maximising your concessional contribution caps across both financial years before age 67, you enhance tax efficiency by reducing personal taxable income and increasing capital within the superannuation environment before work test requirements may apply.</w:t>
+            </w:r>
+          </w:p>
+        </w:tc>
+      </w:tr>
+      <w:tr>
+        <w:tc>
+          <w:tcPr>
+            <w:tcW w:type="dxa" w:w="5256"/>
+            <w:shd w:val="clear" w:fill="E5F4F6"/>
+          </w:tcPr>
+          <w:p>
+            <w:r>
+              <w:rPr>
+                <w:b/>
+                <w:color w:val="0C2E3F"/>
+                <w:sz w:val="17"/>
+              </w:rPr>
+              <w:t>Risks &amp; Disadvantages (bullets)</w:t>
+            </w:r>
+          </w:p>
+        </w:tc>
+        <w:tc>
+          <w:tcPr>
+            <w:tcW w:type="dxa" w:w="5256"/>
+          </w:tcPr>
+          <w:p>
+            <w:r>
+              <w:rPr>
+                <w:sz w:val="19"/>
+              </w:rPr>
+              <w:t>• The strategy relies on your accountant confirming eligibility and lodging the relevant ATO contribution-reserving forms; incorrect implementation can cause an excess concessional contribution.</w:t>
+              <w:br/>
+              <w:t>• The Fund must hold the reserved contribution and allocate it within the prescribed period.</w:t>
+            </w:r>
+          </w:p>
+        </w:tc>
+      </w:tr>
+      <w:tr>
+        <w:tc>
+          <w:tcPr>
+            <w:tcW w:type="dxa" w:w="5256"/>
+            <w:shd w:val="clear" w:fill="E5F4F6"/>
+          </w:tcPr>
+          <w:p>
+            <w:r>
+              <w:rPr>
+                <w:b/>
+                <w:color w:val="0C2E3F"/>
+                <w:sz w:val="17"/>
+              </w:rPr>
+              <w:t>Alternatives (bullets)</w:t>
+            </w:r>
+          </w:p>
+        </w:tc>
+        <w:tc>
+          <w:tcPr>
+            <w:tcW w:type="dxa" w:w="5256"/>
+          </w:tcPr>
+          <w:p>
+            <w:r>
+              <w:rPr>
+                <w:sz w:val="19"/>
+              </w:rPr>
+              <w:t>• Make a single year's concessional contribution only — discounted as it forgoes the additional cap available before the work test applies.</w:t>
             </w:r>
           </w:p>
         </w:tc>
@@ -20365,10 +21004,9 @@
           <w:p>
             <w:r>
               <w:rPr>
-                <w:color w:val="B8860B"/>
-                <w:sz w:val="19"/>
-              </w:rPr>
-              <w:t>We recommend a [Variable Age-Stepped / Level] premium structure for all cover.</w:t>
+                <w:sz w:val="19"/>
+              </w:rPr>
+              <w:t>We recommend a Variable Age-Stepped premium structure for all cover. [Couple variant: where a client prefers long-term affordability, recommend a level premium structure for that person, and a variable age-stepped structure for the other.]</w:t>
             </w:r>
           </w:p>
         </w:tc>
@@ -20397,10 +21035,9 @@
           <w:p>
             <w:r>
               <w:rPr>
-                <w:color w:val="B8860B"/>
-                <w:sz w:val="19"/>
-              </w:rPr>
-              <w:t>The recommended premium structure balances affordability now against the long-term cost of holding the cover.</w:t>
+                <w:sz w:val="19"/>
+              </w:rPr>
+              <w:t>Your premium structure is matched to your affordability preference — variable age-stepped for immediate affordability and flexibility, level for long-term affordability.</w:t>
             </w:r>
           </w:p>
         </w:tc>
@@ -20429,10 +21066,11 @@
           <w:p>
             <w:r>
               <w:rPr>
-                <w:color w:val="B8860B"/>
-                <w:sz w:val="19"/>
-              </w:rPr>
-              <w:t>• A variable age-stepped/stepped structure keeps premiums lower in the early years; a level structure costs more initially but is more stable and can be cheaper over the long term if cover is held for many years.</w:t>
+                <w:sz w:val="19"/>
+              </w:rPr>
+              <w:t>• We have recommended a Variable Age-Stepped premium structure which will give you immediate affordability and ongoing flexibility of your coverage.</w:t>
+              <w:br/>
+              <w:t>• [Level variant] We have recommended retaining a level premium structure which will give you long-term affordability.</w:t>
             </w:r>
           </w:p>
         </w:tc>
@@ -20461,10 +21099,13 @@
           <w:p>
             <w:r>
               <w:rPr>
-                <w:color w:val="B8860B"/>
-                <w:sz w:val="19"/>
-              </w:rPr>
-              <w:t>• Stepped premiums increase with age and can become expensive in later years; level premiums are higher initially and you may pay more if you cancel the cover early.</w:t>
+                <w:sz w:val="19"/>
+              </w:rPr>
+              <w:t>• Premiums increase over time (for stepped / variable age-stepped structures).</w:t>
+              <w:br/>
+              <w:t>• Holding cover inside super reduces your retirement balance over time.</w:t>
+              <w:br/>
+              <w:t>• Underwriting may apply medical exclusions or loadings (e.g. higher premiums for smoker status); a suicide exclusion typically applies for the first 13 months.</w:t>
             </w:r>
           </w:p>
         </w:tc>
@@ -20493,10 +21134,9 @@
           <w:p>
             <w:r>
               <w:rPr>
-                <w:color w:val="B8860B"/>
-                <w:sz w:val="19"/>
-              </w:rPr>
-              <w:t>• The alternative premium structure was considered and discounted based on your expected holding period and affordability.</w:t>
+                <w:sz w:val="19"/>
+              </w:rPr>
+              <w:t>• Structure all premiums as level. While this would reduce your ongoing premium payable, I have discounted this strategy as premiums would be significantly higher initially making short-term affordability an issue. The recommended insurance structure provides immediate affordability and flexibility in the sum insured.</w:t>
             </w:r>
           </w:p>
         </w:tc>
@@ -22968,10 +23608,9 @@
           <w:p>
             <w:r>
               <w:rPr>
-                <w:color w:val="B8860B"/>
-                <w:sz w:val="19"/>
-              </w:rPr>
-              <w:t>We recommend you contact a solicitor to consider establishing a testamentary trust within your Will.</w:t>
+                <w:sz w:val="19"/>
+              </w:rPr>
+              <w:t>We recommend that you contact a solicitor to ensure that you have a valid and updated testamentary trust in place.</w:t>
             </w:r>
           </w:p>
         </w:tc>
@@ -23000,7 +23639,6 @@
           <w:p>
             <w:r>
               <w:rPr>
-                <w:color w:val="B8860B"/>
                 <w:sz w:val="19"/>
               </w:rPr>
               <w:t>A testamentary trust can provide tax‑effective and protected distribution of your estate.</w:t>
@@ -23032,14 +23670,13 @@
           <w:p>
             <w:r>
               <w:rPr>
-                <w:color w:val="B8860B"/>
-                <w:sz w:val="19"/>
-              </w:rPr>
-              <w:t>• Tax benefits — a testamentary trust allows trustees to distribute and split income with tax planning in mind.</w:t>
+                <w:sz w:val="19"/>
+              </w:rPr>
+              <w:t>• Tax Benefits — a testamentary trust allows trustees to distribute and split the income of the trust with tax planning in mind.</w:t>
               <w:br/>
-              <w:t>• Asset protection — the trust holds title to the assets, helping protect them from litigation, bankruptcy or legal action.</w:t>
+              <w:t>• Asset Protection — the trust holds the title to the trust's assets (rather than the beneficiaries directly), allowing the trust to protect assets from any litigation, bankruptcy or legal action.</w:t>
               <w:br/>
-              <w:t>• Flexibility — distributions can be tailored to individual beneficiary circumstances.</w:t>
+              <w:t>• Flexibility — a testamentary trust can provide great flexibility to suit individual circumstances. For example, it is possible to restrict access to assets or distributions to a particular beneficiary.</w:t>
             </w:r>
           </w:p>
         </w:tc>
@@ -23068,10 +23705,15 @@
           <w:p>
             <w:r>
               <w:rPr>
-                <w:color w:val="B8860B"/>
-                <w:sz w:val="19"/>
-              </w:rPr>
-              <w:t>• A testamentary trust adds complexity and ongoing administration; obtain specialist legal advice.</w:t>
+                <w:sz w:val="19"/>
+              </w:rPr>
+              <w:t>• Your solicitor may charge a fee to review / update your Wills and/or Powers of Attorney.</w:t>
+              <w:br/>
+              <w:t>• Estate planning laws vary between Australian states and territories as well as between countries. For this reason, it is important to ensure that your Will is valid for the state in which you live.</w:t>
+              <w:br/>
+              <w:t>• A Will does not expire and it is therefore important to have it reviewed and updated if or when your situation changes.</w:t>
+              <w:br/>
+              <w:t>• Should you fail to update your Will following marriage or divorce it will render it invalid, possibly resulting in parts of your estate not being distributed according to your wishes.</w:t>
             </w:r>
           </w:p>
         </w:tc>
@@ -23100,10 +23742,9 @@
           <w:p>
             <w:r>
               <w:rPr>
-                <w:color w:val="B8860B"/>
-                <w:sz w:val="19"/>
-              </w:rPr>
-              <w:t>• Distribute the estate directly via the Will — discounted where the tax/asset‑protection benefits of a trust are valuable to your beneficiaries.</w:t>
+                <w:sz w:val="19"/>
+              </w:rPr>
+              <w:t>• Distribute the estate directly via the Will — discounted where the tax and asset-protection benefits of a testamentary trust are valuable to your beneficiaries.</w:t>
             </w:r>
           </w:p>
         </w:tc>

</xml_diff>

<commit_message>
Word bank v10: +5 SOAs reviewed (Krogmann/Murcott/MortonLabrom/Gotterson/SmithCollier)
Four docx mined: mostly already-covered (first-home FHSSS couples +
retirement income). Gotterson added tactical variants: reserves-bucket
phased calibration (reduce/restore around upcoming property sales),
rebalance within ABP without crystallising CGT (platform internal order
matching), and bring-forward NCC funded from property-sale proceeds.
No downsizer or SMSF set-up/retain/wind-up appeared in any of the five.
Smith/Collier PDF could not be text-extracted (subset fonts; no poppler/
OCR in env) — needs a .docx copy.

Co-Authored-By: Claude Opus 4.8 <noreply@anthropic.com>
Claude-Session: https://claude.ai/code/session_01CJyTkvXG177amnieSHgEc8
</commit_message>
<xml_diff>
--- a/MWS_SOA_WordBank_Template.docx
+++ b/MWS_SOA_WordBank_Template.docx
@@ -11658,6 +11658,8 @@
               <w:t>• Holding a low-volatility reserve protects you from forced sales at market troughs and preserves your growth assets to recover.</w:t>
               <w:br/>
               <w:t>• You rebalance by topping up reserves from growth assets as part of your annual review.</w:t>
+              <w:br/>
+              <w:t>• The reserve can be phased to your circumstances — e.g. hold a reduced reserve (1.5 years instead of the usual 2.5 years of pension requirements) where known cash inflows such as upcoming property sales are due, then restore it, reviewed each year.</w:t>
             </w:r>
           </w:p>
         </w:tc>
@@ -17805,6 +17807,10 @@
                 <w:sz w:val="19"/>
               </w:rPr>
               <w:t>• Selling to rebalance in accumulation phase can trigger CGT at 10–15%; deferring the rebalance until the assets support a retirement-phase income stream reduces or removes that tax.</w:t>
+              <w:br/>
+              <w:t>• Where the rebalance is done within the Account-Based Pension accounts, we do not anticipate it will crystallise a capital gain, so you should not incur CGT as a result of the rebalance.</w:t>
+              <w:br/>
+              <w:t>• On platforms that match buy and sell orders internally, the rebalance offsets purchases and sales and keeps your portfolio fully invested, avoiding time-out-of-market risk.</w:t>
             </w:r>
           </w:p>
         </w:tc>
@@ -18920,6 +18926,12 @@
               <w:t>• bring-forward rule</w:t>
               <w:br/>
               <w:t>• large non-concessional</w:t>
+              <w:br/>
+              <w:t>• property sale proceeds</w:t>
+              <w:br/>
+              <w:t>• using proceeds</w:t>
+              <w:br/>
+              <w:t>• sale proceeds to super</w:t>
             </w:r>
           </w:p>
         </w:tc>
@@ -19106,6 +19118,8 @@
                 <w:sz w:val="19"/>
               </w:rPr>
               <w:t>• The non-concessional cap is $120,000 for 2024/2025. If you are under 75 years of age during the financial year, a $360,000 contribution can be made by 'bringing forward' two years' worth of contribution caps (in addition to contributions from that year). Accelerates the build-up of retirement savings in the low-tax super environment.</w:t>
+              <w:br/>
+              <w:t>• The bring-forward non-concessional contribution can be funded from the proceeds of a property sale (e.g. $360,000 using a portion of the proceeds), moving sale proceeds into the tax-free/low-tax super environment across the three-year window.</w:t>
             </w:r>
           </w:p>
         </w:tc>
@@ -19137,6 +19151,8 @@
                 <w:sz w:val="19"/>
               </w:rPr>
               <w:t>• Eligibility depends on your age and total super balance at the prior 30 June; contributions in excess of applicable limits will attract penalty tax. Triggering the bring-forward restricts contributions in the following years; contributions are preserved.</w:t>
+              <w:br/>
+              <w:t>• Sale proceeds must be held in cash until the contribution is made, which may mean time out of the market.</w:t>
             </w:r>
           </w:p>
         </w:tc>

</xml_diff>

<commit_message>
Word bank v11: +5 SOAs — downsizer + SMSF gaps closed
Closed the two highest-priority gaps. Downsizer now verbatim (KellySM):
downsizer contribution + sell-home-downsize. SMSF coverage completed:
retain/operate existing SMSF (Gosden/RankinWirth), SMSF w/ corporate
trustee holding geared property + LRBA cashflow (RankinWirth), and
non-separation cost-driven SMSF wind-up to retail (Jafri, verbatim).
Also filled personal-deductible contribution, budget-via-portal, retain
investment property; enriched bring-forward NCC (in-specie execution) and
pre-pension rebalance (SMSF property sale post-pension CGT). 111 scenarios,
99 verbatim / 12 draft.

Co-Authored-By: Claude Opus 4.8 <noreply@anthropic.com>
Claude-Session: https://claude.ai/code/session_01CJyTkvXG177amnieSHgEc8
</commit_message>
<xml_diff>
--- a/MWS_SOA_WordBank_Template.docx
+++ b/MWS_SOA_WordBank_Template.docx
@@ -7215,7 +7215,9 @@
               </w:rPr>
               <w:t>• retain investment property</w:t>
               <w:br/>
-              <w:t>• keep existing IP</w:t>
+              <w:t>• keep the investment property</w:t>
+              <w:br/>
+              <w:t>• hold the property</w:t>
             </w:r>
           </w:p>
         </w:tc>
@@ -7337,10 +7339,9 @@
           <w:p>
             <w:r>
               <w:rPr>
-                <w:color w:val="B8860B"/>
-                <w:sz w:val="19"/>
-              </w:rPr>
-              <w:t>We recommend you retain your existing investment property at [address].</w:t>
+                <w:sz w:val="19"/>
+              </w:rPr>
+              <w:t>We recommend you retain your existing investment property for now. Where a sale is intended, we recommend timing it to occur after your fund has commenced pension phase to minimise capital gains tax, and directing the proceeds to fund your retirement income.</w:t>
             </w:r>
           </w:p>
         </w:tc>
@@ -7369,10 +7370,9 @@
           <w:p>
             <w:r>
               <w:rPr>
-                <w:color w:val="B8860B"/>
-                <w:sz w:val="19"/>
-              </w:rPr>
-              <w:t>Retaining your investment property maintains a growth asset and its associated rental income and tax deductions.</w:t>
+                <w:sz w:val="19"/>
+              </w:rPr>
+              <w:t>The property is retained and, if sold, the sale is timed for the pension phase to reduce or remove CGT, with proceeds funding your income.</w:t>
             </w:r>
           </w:p>
         </w:tc>
@@ -7401,12 +7401,9 @@
           <w:p>
             <w:r>
               <w:rPr>
-                <w:color w:val="B8860B"/>
-                <w:sz w:val="19"/>
-              </w:rPr>
-              <w:t>• Maintains a long‑term growth asset and rental income.</w:t>
-              <w:br/>
-              <w:t>• Avoids transaction costs and capital gains tax that a sale would trigger.</w:t>
+                <w:sz w:val="19"/>
+              </w:rPr>
+              <w:t>• Retaining the property preserves the asset and rental income; timing any eventual sale to the pension phase reduces the CGT payable on the gain.</w:t>
             </w:r>
           </w:p>
         </w:tc>
@@ -7435,12 +7432,9 @@
           <w:p>
             <w:r>
               <w:rPr>
-                <w:color w:val="B8860B"/>
-                <w:sz w:val="19"/>
-              </w:rPr>
-              <w:t>• Property is illiquid and concentrated; values and rent can fall.</w:t>
-              <w:br/>
-              <w:t>• Ongoing holding costs and interest‑rate risk apply.</w:t>
+                <w:sz w:val="19"/>
+              </w:rPr>
+              <w:t>• Property is illiquid and concentrated; market timing on any sale is uncertain; confirm the tax treatment with your accountant.</w:t>
             </w:r>
           </w:p>
         </w:tc>
@@ -7469,10 +7463,9 @@
           <w:p>
             <w:r>
               <w:rPr>
-                <w:color w:val="B8860B"/>
-                <w:sz w:val="19"/>
-              </w:rPr>
-              <w:t>• Sell the property and redeploy the proceeds — discounted where retention better suits your goals and avoids CGT/transaction costs.</w:t>
+                <w:sz w:val="19"/>
+              </w:rPr>
+              <w:t>• Sell the property now — discounted where deferring the sale to pension phase materially reduces CGT.</w:t>
             </w:r>
           </w:p>
         </w:tc>
@@ -7859,11 +7852,13 @@
               <w:rPr>
                 <w:sz w:val="19"/>
               </w:rPr>
-              <w:t>• downsizer</w:t>
+              <w:t>• downsize</w:t>
               <w:br/>
-              <w:t>• downsize home</w:t>
+              <w:t>• sell home and downsize</w:t>
               <w:br/>
-              <w:t>• downsizer contribution</w:t>
+              <w:t>• sell the home</w:t>
+              <w:br/>
+              <w:t>• downsizing</w:t>
             </w:r>
           </w:p>
         </w:tc>
@@ -7985,10 +7980,9 @@
           <w:p>
             <w:r>
               <w:rPr>
-                <w:color w:val="B8860B"/>
-                <w:sz w:val="19"/>
-              </w:rPr>
-              <w:t>We recommend you sell your existing home and use part of the proceeds to make a downsizer contribution of up to $300,000 each ($600,000 combined) to superannuation, with the balance directed as set out in this advice.</w:t>
+                <w:sz w:val="19"/>
+              </w:rPr>
+              <w:t>You have advised you have sold (or intend to sell) your home and would like to use the proceeds to assist in funding your retirement. We recommend you downsize and direct the proceeds to superannuation via the downsizer contribution.</w:t>
             </w:r>
           </w:p>
         </w:tc>
@@ -8017,10 +8011,9 @@
           <w:p>
             <w:r>
               <w:rPr>
-                <w:color w:val="B8860B"/>
-                <w:sz w:val="19"/>
-              </w:rPr>
-              <w:t>Downsizing releases equity for retirement and allows a tax‑effective contribution to superannuation outside the standard caps.</w:t>
+                <w:sz w:val="19"/>
+              </w:rPr>
+              <w:t>Selling and downsizing frees up capital from your home which is redirected into super to fund retirement, without affecting your existing Centrelink entitlements where confirmed.</w:t>
             </w:r>
           </w:p>
         </w:tc>
@@ -8049,12 +8042,9 @@
           <w:p>
             <w:r>
               <w:rPr>
-                <w:color w:val="B8860B"/>
-                <w:sz w:val="19"/>
-              </w:rPr>
-              <w:t>• A downsizer contribution does not count toward your concessional or non‑concessional caps and is not subject to the work test.</w:t>
-              <w:br/>
-              <w:t>• Releases equity to fund retirement while right‑sizing your home.</w:t>
+                <w:sz w:val="19"/>
+              </w:rPr>
+              <w:t>• Downsizing releases equity tied up in your home and, via the downsizer contribution, moves it into the tax-effective super environment to fund a retirement income stream.</w:t>
             </w:r>
           </w:p>
         </w:tc>
@@ -8083,12 +8073,9 @@
           <w:p>
             <w:r>
               <w:rPr>
-                <w:color w:val="B8860B"/>
-                <w:sz w:val="19"/>
-              </w:rPr>
-              <w:t>• A downsizer contribution counts toward your transfer balance cap when moved to pension phase and cannot be withdrawn until a condition of release is met.</w:t>
-              <w:br/>
-              <w:t>• Eligibility conditions apply (age, 10‑year ownership, made within 90 days of settlement).</w:t>
+                <w:sz w:val="19"/>
+              </w:rPr>
+              <w:t>• Selling and buying incurs transaction costs (agent, legal, stamp duty); proceeds in super are preserved; the home sale and any new purchase must be timed carefully.</w:t>
             </w:r>
           </w:p>
         </w:tc>
@@ -8117,10 +8104,9 @@
           <w:p>
             <w:r>
               <w:rPr>
-                <w:color w:val="B8860B"/>
-                <w:sz w:val="19"/>
-              </w:rPr>
-              <w:t>• Retain the home and fund retirement from other assets — discounted where downsizing better meets your goals.</w:t>
+                <w:sz w:val="19"/>
+              </w:rPr>
+              <w:t>• Retain the home and draw on other assets — discounted where releasing home equity is needed to fund retirement.</w:t>
             </w:r>
           </w:p>
         </w:tc>
@@ -17811,6 +17797,8 @@
               <w:t>• Where the rebalance is done within the Account-Based Pension accounts, we do not anticipate it will crystallise a capital gain, so you should not incur CGT as a result of the rebalance.</w:t>
               <w:br/>
               <w:t>• On platforms that match buy and sell orders internally, the rebalance offsets purchases and sales and keeps your portfolio fully invested, avoiding time-out-of-market risk.</w:t>
+              <w:br/>
+              <w:t>• Where an SMSF asset (e.g. an investment property) is to be sold, commencing the Account-Based Pension before the sale means the fund is in retirement phase, so the sale is not expected to be subject to capital gains tax. Please consult your accountant to confirm prior to implementing.</w:t>
             </w:r>
           </w:p>
         </w:tc>
@@ -17873,6 +17861,986 @@
                 <w:sz w:val="19"/>
               </w:rPr>
               <w:t>• Rebalance immediately in accumulation phase — discounted as it crystallises avoidable CGT.</w:t>
+            </w:r>
+          </w:p>
+        </w:tc>
+      </w:tr>
+    </w:tbl>
+    <w:p/>
+    <w:tbl>
+      <w:tblPr>
+        <w:tblStyle w:val="TableGrid"/>
+        <w:tblW w:type="auto" w:w="0"/>
+        <w:jc w:val="left"/>
+        <w:tblLayout w:type="fixed"/>
+        <w:tblLook w:firstColumn="1" w:firstRow="1" w:lastColumn="0" w:lastRow="0" w:noHBand="0" w:noVBand="1" w:val="04A0"/>
+      </w:tblPr>
+      <w:tblGrid>
+        <w:gridCol w:w="5256"/>
+        <w:gridCol w:w="5256"/>
+      </w:tblGrid>
+      <w:tr>
+        <w:tc>
+          <w:tcPr>
+            <w:tcW w:type="dxa" w:w="10080"/>
+            <w:gridSpan w:val="2"/>
+            <w:shd w:val="clear" w:fill="0C2E3F"/>
+          </w:tcPr>
+          <w:p>
+            <w:r>
+              <w:rPr>
+                <w:b/>
+                <w:color w:val="FFFFFF"/>
+                <w:sz w:val="22"/>
+              </w:rPr>
+              <w:t>● Retain an existing SMSF (operate, add account, redirect contributions, reinvest)</w:t>
+            </w:r>
+          </w:p>
+        </w:tc>
+      </w:tr>
+      <w:tr>
+        <w:tc>
+          <w:tcPr>
+            <w:tcW w:type="dxa" w:w="5256"/>
+            <w:shd w:val="clear" w:fill="E5F4F6"/>
+          </w:tcPr>
+          <w:p>
+            <w:r>
+              <w:rPr>
+                <w:b/>
+                <w:color w:val="0C2E3F"/>
+                <w:sz w:val="17"/>
+              </w:rPr>
+              <w:t>Trigger phrases (how it's written in the advice request)</w:t>
+            </w:r>
+          </w:p>
+        </w:tc>
+        <w:tc>
+          <w:tcPr>
+            <w:tcW w:type="dxa" w:w="5256"/>
+          </w:tcPr>
+          <w:p>
+            <w:r>
+              <w:rPr>
+                <w:sz w:val="19"/>
+              </w:rPr>
+              <w:t>• retain smsf</w:t>
+              <w:br/>
+              <w:t>• retain your smsf</w:t>
+              <w:br/>
+              <w:t>• existing smsf</w:t>
+              <w:br/>
+              <w:t>• keep smsf</w:t>
+            </w:r>
+          </w:p>
+        </w:tc>
+      </w:tr>
+      <w:tr>
+        <w:tc>
+          <w:tcPr>
+            <w:tcW w:type="dxa" w:w="5256"/>
+            <w:shd w:val="clear" w:fill="E5F4F6"/>
+          </w:tcPr>
+          <w:p>
+            <w:r>
+              <w:rPr>
+                <w:b/>
+                <w:color w:val="0C2E3F"/>
+                <w:sz w:val="17"/>
+              </w:rPr>
+              <w:t>Always-on / Tailored</w:t>
+            </w:r>
+          </w:p>
+        </w:tc>
+        <w:tc>
+          <w:tcPr>
+            <w:tcW w:type="dxa" w:w="5256"/>
+          </w:tcPr>
+          <w:p>
+            <w:r>
+              <w:rPr>
+                <w:sz w:val="19"/>
+              </w:rPr>
+              <w:t>Tailored</w:t>
+            </w:r>
+          </w:p>
+        </w:tc>
+      </w:tr>
+      <w:tr>
+        <w:tc>
+          <w:tcPr>
+            <w:tcW w:type="dxa" w:w="5256"/>
+            <w:shd w:val="clear" w:fill="E5F4F6"/>
+          </w:tcPr>
+          <w:p>
+            <w:r>
+              <w:rPr>
+                <w:b/>
+                <w:color w:val="0C2E3F"/>
+                <w:sz w:val="17"/>
+              </w:rPr>
+              <w:t>Scope gate (only show if…)</w:t>
+            </w:r>
+          </w:p>
+        </w:tc>
+        <w:tc>
+          <w:tcPr>
+            <w:tcW w:type="dxa" w:w="5256"/>
+          </w:tcPr>
+          <w:p>
+            <w:r>
+              <w:rPr>
+                <w:sz w:val="19"/>
+              </w:rPr>
+              <w:t>Existing SMSF that is to be kept (not wound up)</w:t>
+            </w:r>
+          </w:p>
+        </w:tc>
+      </w:tr>
+      <w:tr>
+        <w:tc>
+          <w:tcPr>
+            <w:tcW w:type="dxa" w:w="5256"/>
+            <w:shd w:val="clear" w:fill="E5F4F6"/>
+          </w:tcPr>
+          <w:p>
+            <w:r>
+              <w:rPr>
+                <w:b/>
+                <w:color w:val="0C2E3F"/>
+                <w:sz w:val="17"/>
+              </w:rPr>
+              <w:t>Figures it pulls ($ / %)</w:t>
+            </w:r>
+          </w:p>
+        </w:tc>
+        <w:tc>
+          <w:tcPr>
+            <w:tcW w:type="dxa" w:w="5256"/>
+          </w:tcPr>
+          <w:p>
+            <w:r>
+              <w:rPr>
+                <w:sz w:val="19"/>
+              </w:rPr>
+              <w:t>—</w:t>
+            </w:r>
+          </w:p>
+        </w:tc>
+      </w:tr>
+      <w:tr>
+        <w:tc>
+          <w:tcPr>
+            <w:tcW w:type="dxa" w:w="5256"/>
+            <w:shd w:val="clear" w:fill="E5F4F6"/>
+          </w:tcPr>
+          <w:p>
+            <w:r>
+              <w:rPr>
+                <w:b/>
+                <w:color w:val="0C2E3F"/>
+                <w:sz w:val="17"/>
+              </w:rPr>
+              <w:t>Summary – Strategies line</w:t>
+            </w:r>
+          </w:p>
+        </w:tc>
+        <w:tc>
+          <w:tcPr>
+            <w:tcW w:type="dxa" w:w="5256"/>
+          </w:tcPr>
+          <w:p>
+            <w:r>
+              <w:rPr>
+                <w:sz w:val="19"/>
+              </w:rPr>
+              <w:t>We recommend you retain your existing SMSF. We recommend you establish a new investment account held by the SMSF (invested in line with your risk profile), retain your existing SMSF cash account, provide your employer with the fund details so future contributions are directed to the SMSF, and reinvest distributions from the SMSF investment portfolio.</w:t>
+            </w:r>
+          </w:p>
+        </w:tc>
+      </w:tr>
+      <w:tr>
+        <w:tc>
+          <w:tcPr>
+            <w:tcW w:type="dxa" w:w="5256"/>
+            <w:shd w:val="clear" w:fill="E5F4F6"/>
+          </w:tcPr>
+          <w:p>
+            <w:r>
+              <w:rPr>
+                <w:b/>
+                <w:color w:val="0C2E3F"/>
+                <w:sz w:val="17"/>
+              </w:rPr>
+              <w:t>Summary – Outcomes line</w:t>
+            </w:r>
+          </w:p>
+        </w:tc>
+        <w:tc>
+          <w:tcPr>
+            <w:tcW w:type="dxa" w:w="5256"/>
+          </w:tcPr>
+          <w:p>
+            <w:r>
+              <w:rPr>
+                <w:sz w:val="19"/>
+              </w:rPr>
+              <w:t>Your SMSF continues as your super vehicle, with a customised investment account, a central cash account for transactions and compliance costs, all contributions consolidated to the fund, and distributions reinvested to compound.</w:t>
+            </w:r>
+          </w:p>
+        </w:tc>
+      </w:tr>
+      <w:tr>
+        <w:tc>
+          <w:tcPr>
+            <w:tcW w:type="dxa" w:w="5256"/>
+            <w:shd w:val="clear" w:fill="E5F4F6"/>
+          </w:tcPr>
+          <w:p>
+            <w:r>
+              <w:rPr>
+                <w:b/>
+                <w:color w:val="0C2E3F"/>
+                <w:sz w:val="17"/>
+              </w:rPr>
+              <w:t>Why / In line with your goals (bullets)</w:t>
+            </w:r>
+          </w:p>
+        </w:tc>
+        <w:tc>
+          <w:tcPr>
+            <w:tcW w:type="dxa" w:w="5256"/>
+          </w:tcPr>
+          <w:p>
+            <w:r>
+              <w:rPr>
+                <w:sz w:val="19"/>
+              </w:rPr>
+              <w:t>• Retaining the SMSF cash account consolidates all super transactions into one central account, easing monitoring and providing liquidity for ongoing costs and administrative fees of being an SMSF trustee.</w:t>
+              <w:br/>
+              <w:t>• Directing all future employer (and personal) contributions to the SMSF consolidates your super into one fund for easier management.</w:t>
+              <w:br/>
+              <w:t>• Reinvesting distributions accelerates growth potential through compounding.</w:t>
+            </w:r>
+          </w:p>
+        </w:tc>
+      </w:tr>
+      <w:tr>
+        <w:tc>
+          <w:tcPr>
+            <w:tcW w:type="dxa" w:w="5256"/>
+            <w:shd w:val="clear" w:fill="E5F4F6"/>
+          </w:tcPr>
+          <w:p>
+            <w:r>
+              <w:rPr>
+                <w:b/>
+                <w:color w:val="0C2E3F"/>
+                <w:sz w:val="17"/>
+              </w:rPr>
+              <w:t>Risks &amp; Disadvantages (bullets)</w:t>
+            </w:r>
+          </w:p>
+        </w:tc>
+        <w:tc>
+          <w:tcPr>
+            <w:tcW w:type="dxa" w:w="5256"/>
+          </w:tcPr>
+          <w:p>
+            <w:r>
+              <w:rPr>
+                <w:sz w:val="19"/>
+              </w:rPr>
+              <w:t>• As trustee you remain responsible for the fund's compliance, administration and costs.</w:t>
+              <w:br/>
+              <w:t>• Reinvesting distributions means no access to that income until a condition of release is met.</w:t>
+            </w:r>
+          </w:p>
+        </w:tc>
+      </w:tr>
+      <w:tr>
+        <w:tc>
+          <w:tcPr>
+            <w:tcW w:type="dxa" w:w="5256"/>
+            <w:shd w:val="clear" w:fill="E5F4F6"/>
+          </w:tcPr>
+          <w:p>
+            <w:r>
+              <w:rPr>
+                <w:b/>
+                <w:color w:val="0C2E3F"/>
+                <w:sz w:val="17"/>
+              </w:rPr>
+              <w:t>Alternatives (bullets)</w:t>
+            </w:r>
+          </w:p>
+        </w:tc>
+        <w:tc>
+          <w:tcPr>
+            <w:tcW w:type="dxa" w:w="5256"/>
+          </w:tcPr>
+          <w:p>
+            <w:r>
+              <w:rPr>
+                <w:sz w:val="19"/>
+              </w:rPr>
+              <w:t>• Wind up the SMSF and roll to a retail/platform fund — discounted where the SMSF holds assets (e.g. an investment property) central to your long-term strategy.</w:t>
+            </w:r>
+          </w:p>
+        </w:tc>
+      </w:tr>
+    </w:tbl>
+    <w:p/>
+    <w:tbl>
+      <w:tblPr>
+        <w:tblStyle w:val="TableGrid"/>
+        <w:tblW w:type="auto" w:w="0"/>
+        <w:jc w:val="left"/>
+        <w:tblLayout w:type="fixed"/>
+        <w:tblLook w:firstColumn="1" w:firstRow="1" w:lastColumn="0" w:lastRow="0" w:noHBand="0" w:noVBand="1" w:val="04A0"/>
+      </w:tblPr>
+      <w:tblGrid>
+        <w:gridCol w:w="5256"/>
+        <w:gridCol w:w="5256"/>
+      </w:tblGrid>
+      <w:tr>
+        <w:tc>
+          <w:tcPr>
+            <w:tcW w:type="dxa" w:w="10080"/>
+            <w:gridSpan w:val="2"/>
+            <w:shd w:val="clear" w:fill="0C2E3F"/>
+          </w:tcPr>
+          <w:p>
+            <w:r>
+              <w:rPr>
+                <w:b/>
+                <w:color w:val="FFFFFF"/>
+                <w:sz w:val="22"/>
+              </w:rPr>
+              <w:t>● SMSF with corporate trustee holding a geared investment property (LRBA cashflow)</w:t>
+            </w:r>
+          </w:p>
+        </w:tc>
+      </w:tr>
+      <w:tr>
+        <w:tc>
+          <w:tcPr>
+            <w:tcW w:type="dxa" w:w="5256"/>
+            <w:shd w:val="clear" w:fill="E5F4F6"/>
+          </w:tcPr>
+          <w:p>
+            <w:r>
+              <w:rPr>
+                <w:b/>
+                <w:color w:val="0C2E3F"/>
+                <w:sz w:val="17"/>
+              </w:rPr>
+              <w:t>Trigger phrases (how it's written in the advice request)</w:t>
+            </w:r>
+          </w:p>
+        </w:tc>
+        <w:tc>
+          <w:tcPr>
+            <w:tcW w:type="dxa" w:w="5256"/>
+          </w:tcPr>
+          <w:p>
+            <w:r>
+              <w:rPr>
+                <w:sz w:val="19"/>
+              </w:rPr>
+              <w:t>• smsf property</w:t>
+              <w:br/>
+              <w:t>• corporate trustee</w:t>
+              <w:br/>
+              <w:t>• limited recourse</w:t>
+              <w:br/>
+              <w:t>• lrba</w:t>
+              <w:br/>
+              <w:t>• smsf investment property</w:t>
+            </w:r>
+          </w:p>
+        </w:tc>
+      </w:tr>
+      <w:tr>
+        <w:tc>
+          <w:tcPr>
+            <w:tcW w:type="dxa" w:w="5256"/>
+            <w:shd w:val="clear" w:fill="E5F4F6"/>
+          </w:tcPr>
+          <w:p>
+            <w:r>
+              <w:rPr>
+                <w:b/>
+                <w:color w:val="0C2E3F"/>
+                <w:sz w:val="17"/>
+              </w:rPr>
+              <w:t>Always-on / Tailored</w:t>
+            </w:r>
+          </w:p>
+        </w:tc>
+        <w:tc>
+          <w:tcPr>
+            <w:tcW w:type="dxa" w:w="5256"/>
+          </w:tcPr>
+          <w:p>
+            <w:r>
+              <w:rPr>
+                <w:sz w:val="19"/>
+              </w:rPr>
+              <w:t>Tailored</w:t>
+            </w:r>
+          </w:p>
+        </w:tc>
+      </w:tr>
+      <w:tr>
+        <w:tc>
+          <w:tcPr>
+            <w:tcW w:type="dxa" w:w="5256"/>
+            <w:shd w:val="clear" w:fill="E5F4F6"/>
+          </w:tcPr>
+          <w:p>
+            <w:r>
+              <w:rPr>
+                <w:b/>
+                <w:color w:val="0C2E3F"/>
+                <w:sz w:val="17"/>
+              </w:rPr>
+              <w:t>Scope gate (only show if…)</w:t>
+            </w:r>
+          </w:p>
+        </w:tc>
+        <w:tc>
+          <w:tcPr>
+            <w:tcW w:type="dxa" w:w="5256"/>
+          </w:tcPr>
+          <w:p>
+            <w:r>
+              <w:rPr>
+                <w:sz w:val="19"/>
+              </w:rPr>
+              <w:t>SMSF holding (or acquiring) real property, typically with secured debt</w:t>
+            </w:r>
+          </w:p>
+        </w:tc>
+      </w:tr>
+      <w:tr>
+        <w:tc>
+          <w:tcPr>
+            <w:tcW w:type="dxa" w:w="5256"/>
+            <w:shd w:val="clear" w:fill="E5F4F6"/>
+          </w:tcPr>
+          <w:p>
+            <w:r>
+              <w:rPr>
+                <w:b/>
+                <w:color w:val="0C2E3F"/>
+                <w:sz w:val="17"/>
+              </w:rPr>
+              <w:t>Figures it pulls ($ / %)</w:t>
+            </w:r>
+          </w:p>
+        </w:tc>
+        <w:tc>
+          <w:tcPr>
+            <w:tcW w:type="dxa" w:w="5256"/>
+          </w:tcPr>
+          <w:p>
+            <w:r>
+              <w:rPr>
+                <w:sz w:val="19"/>
+              </w:rPr>
+              <w:t>—</w:t>
+            </w:r>
+          </w:p>
+        </w:tc>
+      </w:tr>
+      <w:tr>
+        <w:tc>
+          <w:tcPr>
+            <w:tcW w:type="dxa" w:w="5256"/>
+            <w:shd w:val="clear" w:fill="E5F4F6"/>
+          </w:tcPr>
+          <w:p>
+            <w:r>
+              <w:rPr>
+                <w:b/>
+                <w:color w:val="0C2E3F"/>
+                <w:sz w:val="17"/>
+              </w:rPr>
+              <w:t>Summary – Strategies line</w:t>
+            </w:r>
+          </w:p>
+        </w:tc>
+        <w:tc>
+          <w:tcPr>
+            <w:tcW w:type="dxa" w:w="5256"/>
+          </w:tcPr>
+          <w:p>
+            <w:r>
+              <w:rPr>
+                <w:sz w:val="19"/>
+              </w:rPr>
+              <w:t>Your SMSF (corporate trustee — Pty Ltd ATF the fund) holds an investment property with secured debt. We recommend consolidating both members' existing super into the SMSF via full rollover, maintaining a dedicated cash reserve for SMSF administration and property-related costs, and deploying the property's net rental income to fund your ongoing regular SMSF contributions.</w:t>
+            </w:r>
+          </w:p>
+        </w:tc>
+      </w:tr>
+      <w:tr>
+        <w:tc>
+          <w:tcPr>
+            <w:tcW w:type="dxa" w:w="5256"/>
+            <w:shd w:val="clear" w:fill="E5F4F6"/>
+          </w:tcPr>
+          <w:p>
+            <w:r>
+              <w:rPr>
+                <w:b/>
+                <w:color w:val="0C2E3F"/>
+                <w:sz w:val="17"/>
+              </w:rPr>
+              <w:t>Summary – Outcomes line</w:t>
+            </w:r>
+          </w:p>
+        </w:tc>
+        <w:tc>
+          <w:tcPr>
+            <w:tcW w:type="dxa" w:w="5256"/>
+          </w:tcPr>
+          <w:p>
+            <w:r>
+              <w:rPr>
+                <w:sz w:val="19"/>
+              </w:rPr>
+              <w:t>Both members' super is pooled in the SMSF behind the property, with a cash buffer for costs and rental surplus recycled into ongoing contributions.</w:t>
+            </w:r>
+          </w:p>
+        </w:tc>
+      </w:tr>
+      <w:tr>
+        <w:tc>
+          <w:tcPr>
+            <w:tcW w:type="dxa" w:w="5256"/>
+            <w:shd w:val="clear" w:fill="E5F4F6"/>
+          </w:tcPr>
+          <w:p>
+            <w:r>
+              <w:rPr>
+                <w:b/>
+                <w:color w:val="0C2E3F"/>
+                <w:sz w:val="17"/>
+              </w:rPr>
+              <w:t>Why / In line with your goals (bullets)</w:t>
+            </w:r>
+          </w:p>
+        </w:tc>
+        <w:tc>
+          <w:tcPr>
+            <w:tcW w:type="dxa" w:w="5256"/>
+          </w:tcPr>
+          <w:p>
+            <w:r>
+              <w:rPr>
+                <w:sz w:val="19"/>
+              </w:rPr>
+              <w:t>• A corporate trustee structure (Pty Ltd as trustee for the fund) simplifies succession and limits trustee liability compared with individual trustees.</w:t>
+              <w:br/>
+              <w:t>• Consolidating both members' balances and the rental surplus into the fund concentrates capital behind the long-term property strategy.</w:t>
+            </w:r>
+          </w:p>
+        </w:tc>
+      </w:tr>
+      <w:tr>
+        <w:tc>
+          <w:tcPr>
+            <w:tcW w:type="dxa" w:w="5256"/>
+            <w:shd w:val="clear" w:fill="E5F4F6"/>
+          </w:tcPr>
+          <w:p>
+            <w:r>
+              <w:rPr>
+                <w:b/>
+                <w:color w:val="0C2E3F"/>
+                <w:sz w:val="17"/>
+              </w:rPr>
+              <w:t>Risks &amp; Disadvantages (bullets)</w:t>
+            </w:r>
+          </w:p>
+        </w:tc>
+        <w:tc>
+          <w:tcPr>
+            <w:tcW w:type="dxa" w:w="5256"/>
+          </w:tcPr>
+          <w:p>
+            <w:r>
+              <w:rPr>
+                <w:sz w:val="19"/>
+              </w:rPr>
+              <w:t>• SMSF borrowing and property holding add audit, compliance and liquidity complexity; the fund must hold enough cash to meet loan repayments and costs.</w:t>
+              <w:br/>
+              <w:t>• Property is illiquid and concentrated; a fall in value or rental income affects the fund's ability to meet obligations.</w:t>
+            </w:r>
+          </w:p>
+        </w:tc>
+      </w:tr>
+      <w:tr>
+        <w:tc>
+          <w:tcPr>
+            <w:tcW w:type="dxa" w:w="5256"/>
+            <w:shd w:val="clear" w:fill="E5F4F6"/>
+          </w:tcPr>
+          <w:p>
+            <w:r>
+              <w:rPr>
+                <w:b/>
+                <w:color w:val="0C2E3F"/>
+                <w:sz w:val="17"/>
+              </w:rPr>
+              <w:t>Alternatives (bullets)</w:t>
+            </w:r>
+          </w:p>
+        </w:tc>
+        <w:tc>
+          <w:tcPr>
+            <w:tcW w:type="dxa" w:w="5256"/>
+          </w:tcPr>
+          <w:p>
+            <w:r>
+              <w:rPr>
+                <w:sz w:val="19"/>
+              </w:rPr>
+              <w:t>• Wind up the SMSF — discounted as the fund was established to hold the investment property as part of your long-term superannuation strategy.</w:t>
+            </w:r>
+          </w:p>
+        </w:tc>
+      </w:tr>
+    </w:tbl>
+    <w:p/>
+    <w:tbl>
+      <w:tblPr>
+        <w:tblStyle w:val="TableGrid"/>
+        <w:tblW w:type="auto" w:w="0"/>
+        <w:jc w:val="left"/>
+        <w:tblLayout w:type="fixed"/>
+        <w:tblLook w:firstColumn="1" w:firstRow="1" w:lastColumn="0" w:lastRow="0" w:noHBand="0" w:noVBand="1" w:val="04A0"/>
+      </w:tblPr>
+      <w:tblGrid>
+        <w:gridCol w:w="5256"/>
+        <w:gridCol w:w="5256"/>
+      </w:tblGrid>
+      <w:tr>
+        <w:tc>
+          <w:tcPr>
+            <w:tcW w:type="dxa" w:w="10080"/>
+            <w:gridSpan w:val="2"/>
+            <w:shd w:val="clear" w:fill="0C2E3F"/>
+          </w:tcPr>
+          <w:p>
+            <w:r>
+              <w:rPr>
+                <w:b/>
+                <w:color w:val="FFFFFF"/>
+                <w:sz w:val="22"/>
+              </w:rPr>
+              <w:t>● SMSF wind-up / consolidation to a retail fund (non-separation, cost/suitability driven)</w:t>
+            </w:r>
+          </w:p>
+        </w:tc>
+      </w:tr>
+      <w:tr>
+        <w:tc>
+          <w:tcPr>
+            <w:tcW w:type="dxa" w:w="5256"/>
+            <w:shd w:val="clear" w:fill="E5F4F6"/>
+          </w:tcPr>
+          <w:p>
+            <w:r>
+              <w:rPr>
+                <w:b/>
+                <w:color w:val="0C2E3F"/>
+                <w:sz w:val="17"/>
+              </w:rPr>
+              <w:t>Trigger phrases (how it's written in the advice request)</w:t>
+            </w:r>
+          </w:p>
+        </w:tc>
+        <w:tc>
+          <w:tcPr>
+            <w:tcW w:type="dxa" w:w="5256"/>
+          </w:tcPr>
+          <w:p>
+            <w:r>
+              <w:rPr>
+                <w:sz w:val="19"/>
+              </w:rPr>
+              <w:t>• close your smsf</w:t>
+              <w:br/>
+              <w:t>• wind up smsf</w:t>
+              <w:br/>
+              <w:t>• wind-up smsf</w:t>
+              <w:br/>
+              <w:t>• smsf not the right vehicle</w:t>
+              <w:br/>
+              <w:t>• consolidate smsf to retail</w:t>
+              <w:br/>
+              <w:t>• review suitability of smsf</w:t>
+            </w:r>
+          </w:p>
+        </w:tc>
+      </w:tr>
+      <w:tr>
+        <w:tc>
+          <w:tcPr>
+            <w:tcW w:type="dxa" w:w="5256"/>
+            <w:shd w:val="clear" w:fill="E5F4F6"/>
+          </w:tcPr>
+          <w:p>
+            <w:r>
+              <w:rPr>
+                <w:b/>
+                <w:color w:val="0C2E3F"/>
+                <w:sz w:val="17"/>
+              </w:rPr>
+              <w:t>Always-on / Tailored</w:t>
+            </w:r>
+          </w:p>
+        </w:tc>
+        <w:tc>
+          <w:tcPr>
+            <w:tcW w:type="dxa" w:w="5256"/>
+          </w:tcPr>
+          <w:p>
+            <w:r>
+              <w:rPr>
+                <w:sz w:val="19"/>
+              </w:rPr>
+              <w:t>Tailored</w:t>
+            </w:r>
+          </w:p>
+        </w:tc>
+      </w:tr>
+      <w:tr>
+        <w:tc>
+          <w:tcPr>
+            <w:tcW w:type="dxa" w:w="5256"/>
+            <w:shd w:val="clear" w:fill="E5F4F6"/>
+          </w:tcPr>
+          <w:p>
+            <w:r>
+              <w:rPr>
+                <w:b/>
+                <w:color w:val="0C2E3F"/>
+                <w:sz w:val="17"/>
+              </w:rPr>
+              <w:t>Scope gate (only show if…)</w:t>
+            </w:r>
+          </w:p>
+        </w:tc>
+        <w:tc>
+          <w:tcPr>
+            <w:tcW w:type="dxa" w:w="5256"/>
+          </w:tcPr>
+          <w:p>
+            <w:r>
+              <w:rPr>
+                <w:sz w:val="19"/>
+              </w:rPr>
+              <w:t>Existing SMSF whose original purpose no longer applies / costs outweigh benefit</w:t>
+            </w:r>
+          </w:p>
+        </w:tc>
+      </w:tr>
+      <w:tr>
+        <w:tc>
+          <w:tcPr>
+            <w:tcW w:type="dxa" w:w="5256"/>
+            <w:shd w:val="clear" w:fill="E5F4F6"/>
+          </w:tcPr>
+          <w:p>
+            <w:r>
+              <w:rPr>
+                <w:b/>
+                <w:color w:val="0C2E3F"/>
+                <w:sz w:val="17"/>
+              </w:rPr>
+              <w:t>Figures it pulls ($ / %)</w:t>
+            </w:r>
+          </w:p>
+        </w:tc>
+        <w:tc>
+          <w:tcPr>
+            <w:tcW w:type="dxa" w:w="5256"/>
+          </w:tcPr>
+          <w:p>
+            <w:r>
+              <w:rPr>
+                <w:sz w:val="19"/>
+              </w:rPr>
+              <w:t>Estimated reduction in ongoing admin fees p.a.</w:t>
+            </w:r>
+          </w:p>
+        </w:tc>
+      </w:tr>
+      <w:tr>
+        <w:tc>
+          <w:tcPr>
+            <w:tcW w:type="dxa" w:w="5256"/>
+            <w:shd w:val="clear" w:fill="E5F4F6"/>
+          </w:tcPr>
+          <w:p>
+            <w:r>
+              <w:rPr>
+                <w:b/>
+                <w:color w:val="0C2E3F"/>
+                <w:sz w:val="17"/>
+              </w:rPr>
+              <w:t>Summary – Strategies line</w:t>
+            </w:r>
+          </w:p>
+        </w:tc>
+        <w:tc>
+          <w:tcPr>
+            <w:tcW w:type="dxa" w:w="5256"/>
+          </w:tcPr>
+          <w:p>
+            <w:r>
+              <w:rPr>
+                <w:sz w:val="19"/>
+              </w:rPr>
+              <w:t>You have asked us to review the long-term suitability of retaining your SMSF. The initial purpose of establishing the SMSF was to purchase a property; as that is no longer being pursued, we recommend you close your SMSF and rollover the full benefits to a new retail/platform fund customised for your needs.</w:t>
+            </w:r>
+          </w:p>
+        </w:tc>
+      </w:tr>
+      <w:tr>
+        <w:tc>
+          <w:tcPr>
+            <w:tcW w:type="dxa" w:w="5256"/>
+            <w:shd w:val="clear" w:fill="E5F4F6"/>
+          </w:tcPr>
+          <w:p>
+            <w:r>
+              <w:rPr>
+                <w:b/>
+                <w:color w:val="0C2E3F"/>
+                <w:sz w:val="17"/>
+              </w:rPr>
+              <w:t>Summary – Outcomes line</w:t>
+            </w:r>
+          </w:p>
+        </w:tc>
+        <w:tc>
+          <w:tcPr>
+            <w:tcW w:type="dxa" w:w="5256"/>
+          </w:tcPr>
+          <w:p>
+            <w:r>
+              <w:rPr>
+                <w:sz w:val="19"/>
+              </w:rPr>
+              <w:t>Your super is simplified into a retail/platform fund, removing the cost and trustee responsibilities of the SMSF while keeping access to the recommended investment portfolio.</w:t>
+            </w:r>
+          </w:p>
+        </w:tc>
+      </w:tr>
+      <w:tr>
+        <w:tc>
+          <w:tcPr>
+            <w:tcW w:type="dxa" w:w="5256"/>
+            <w:shd w:val="clear" w:fill="E5F4F6"/>
+          </w:tcPr>
+          <w:p>
+            <w:r>
+              <w:rPr>
+                <w:b/>
+                <w:color w:val="0C2E3F"/>
+                <w:sz w:val="17"/>
+              </w:rPr>
+              <w:t>Why / In line with your goals (bullets)</w:t>
+            </w:r>
+          </w:p>
+        </w:tc>
+        <w:tc>
+          <w:tcPr>
+            <w:tcW w:type="dxa" w:w="5256"/>
+          </w:tcPr>
+          <w:p>
+            <w:r>
+              <w:rPr>
+                <w:sz w:val="19"/>
+              </w:rPr>
+              <w:t>• We believe an SMSF is not the right vehicle for your super, considering your current SMSF position.</w:t>
+              <w:br/>
+              <w:t>• By simplifying your superannuation you will not be burdened by the responsibilities of operating an SMSF.</w:t>
+              <w:br/>
+              <w:t>• Since you are not actively considering purchasing property through your superannuation as initially planned, closing the SMSF aligns better with your current goals and objectives.</w:t>
+              <w:br/>
+              <w:t>• Transferring from an SMSF to a retail superannuation fund reduces your ongoing administrative fees and eliminates your legal and administrative responsibilities as an SMSF trustee.</w:t>
+              <w:br/>
+              <w:t>• We have discussed the short and long-term implications, including the costs that would occur if you ever wished to re-establish the SMSF in the future after winding it up now.</w:t>
+            </w:r>
+          </w:p>
+        </w:tc>
+      </w:tr>
+      <w:tr>
+        <w:tc>
+          <w:tcPr>
+            <w:tcW w:type="dxa" w:w="5256"/>
+            <w:shd w:val="clear" w:fill="E5F4F6"/>
+          </w:tcPr>
+          <w:p>
+            <w:r>
+              <w:rPr>
+                <w:b/>
+                <w:color w:val="0C2E3F"/>
+                <w:sz w:val="17"/>
+              </w:rPr>
+              <w:t>Risks &amp; Disadvantages (bullets)</w:t>
+            </w:r>
+          </w:p>
+        </w:tc>
+        <w:tc>
+          <w:tcPr>
+            <w:tcW w:type="dxa" w:w="5256"/>
+          </w:tcPr>
+          <w:p>
+            <w:r>
+              <w:rPr>
+                <w:sz w:val="19"/>
+              </w:rPr>
+              <w:t>• The SMSF wind-up will require the sale of the existing share portfolio within the fund, which may have capital gains implications and transaction costs.</w:t>
+              <w:br/>
+              <w:t>• Wind-up costs include completion of the current and previous SMSF financial statements, tax returns and any audit/compliance costs.</w:t>
+            </w:r>
+          </w:p>
+        </w:tc>
+      </w:tr>
+      <w:tr>
+        <w:tc>
+          <w:tcPr>
+            <w:tcW w:type="dxa" w:w="5256"/>
+            <w:shd w:val="clear" w:fill="E5F4F6"/>
+          </w:tcPr>
+          <w:p>
+            <w:r>
+              <w:rPr>
+                <w:b/>
+                <w:color w:val="0C2E3F"/>
+                <w:sz w:val="17"/>
+              </w:rPr>
+              <w:t>Alternatives (bullets)</w:t>
+            </w:r>
+          </w:p>
+        </w:tc>
+        <w:tc>
+          <w:tcPr>
+            <w:tcW w:type="dxa" w:w="5256"/>
+          </w:tcPr>
+          <w:p>
+            <w:r>
+              <w:rPr>
+                <w:sz w:val="19"/>
+              </w:rPr>
+              <w:t>• Retain your existing SMSF — discounted as an SMSF has high costs and ongoing legal/administrative trustee requirements that are not needed to meet your retirement goals where the original purpose is no longer being pursued.</w:t>
             </w:r>
           </w:p>
         </w:tc>
@@ -19120,6 +20088,10 @@
               <w:t>• The non-concessional cap is $120,000 for 2024/2025. If you are under 75 years of age during the financial year, a $360,000 contribution can be made by 'bringing forward' two years' worth of contribution caps (in addition to contributions from that year). Accelerates the build-up of retirement savings in the low-tax super environment.</w:t>
               <w:br/>
               <w:t>• The bring-forward non-concessional contribution can be funded from the proceeds of a property sale (e.g. $360,000 using a portion of the proceeds), moving sale proceeds into the tax-free/low-tax super environment across the three-year window.</w:t>
+              <w:br/>
+              <w:t>• The bring-forward rule lets you use future years' non-concessional caps to make a larger one-off contribution now, maximising the funds in the tax-free super environment to draw retirement income from.</w:t>
+              <w:br/>
+              <w:t>• The contribution can be made via in-specie transfer of an existing investment portfolio (rather than selling to cash and re-buying), saving transaction costs and buy/sell spreads and avoiding time out of the market — noting the in-specie transfer crystallises CGT on the transferred assets.</w:t>
             </w:r>
           </w:p>
         </w:tc>
@@ -20199,7 +21171,11 @@
               </w:rPr>
               <w:t>• personal deductible contribution</w:t>
               <w:br/>
-              <w:t>• claim a deduction for contribution</w:t>
+              <w:t>• personal concessional</w:t>
+              <w:br/>
+              <w:t>• claim a tax deduction for contribution</w:t>
+              <w:br/>
+              <w:t>• lump sum concessional</w:t>
             </w:r>
           </w:p>
         </w:tc>
@@ -20321,10 +21297,9 @@
           <w:p>
             <w:r>
               <w:rPr>
-                <w:color w:val="B8860B"/>
-                <w:sz w:val="19"/>
-              </w:rPr>
-              <w:t>We recommend you make a personal contribution of $XXX to superannuation and lodge a notice of intent to claim a tax deduction.</w:t>
+                <w:sz w:val="19"/>
+              </w:rPr>
+              <w:t>We recommend you commence making yearly concessional (personal deductible) contributions, setting aside the funds in your cash account through the year and making the contribution as a lump sum each year, then claiming a tax deduction for it.</w:t>
             </w:r>
           </w:p>
         </w:tc>
@@ -20353,10 +21328,9 @@
           <w:p>
             <w:r>
               <w:rPr>
-                <w:color w:val="B8860B"/>
-                <w:sz w:val="19"/>
-              </w:rPr>
-              <w:t>A personal deductible contribution reduces your assessable income while building retirement savings.</w:t>
+                <w:sz w:val="19"/>
+              </w:rPr>
+              <w:t>You use your concessional cap via a personal deductible contribution, reducing taxable income and building super, without needing a salary-sacrifice arrangement with your employer.</w:t>
             </w:r>
           </w:p>
         </w:tc>
@@ -20385,12 +21359,11 @@
           <w:p>
             <w:r>
               <w:rPr>
-                <w:color w:val="B8860B"/>
-                <w:sz w:val="19"/>
-              </w:rPr>
-              <w:t>• Reduces your assessable income (taxed at 15% in super rather than your marginal rate) up to your concessional cap.</w:t>
+                <w:sz w:val="19"/>
+              </w:rPr>
+              <w:t>• Making ongoing concessional contributions helps reduce the effect of adviser fees and insurance premiums on your superannuation balance.</w:t>
               <w:br/>
-              <w:t>• Useful where salary sacrifice is not available.</w:t>
+              <w:t>• Claiming the contribution as a tax deduction provides net tax savings by moving income into the 15% super environment instead of your marginal rate.</w:t>
             </w:r>
           </w:p>
         </w:tc>
@@ -20419,10 +21392,9 @@
           <w:p>
             <w:r>
               <w:rPr>
-                <w:color w:val="B8860B"/>
-                <w:sz w:val="19"/>
-              </w:rPr>
-              <w:t>• You must lodge a valid notice of intent and have it acknowledged before claiming the deduction; counts toward your concessional cap; preserved until a condition of release.</w:t>
+                <w:sz w:val="19"/>
+              </w:rPr>
+              <w:t>• You must stay within the concessional cap to avoid excess-contribution tax, and lodge a valid notice of intent to claim the deduction with your fund.</w:t>
             </w:r>
           </w:p>
         </w:tc>
@@ -20451,10 +21423,9 @@
           <w:p>
             <w:r>
               <w:rPr>
-                <w:color w:val="B8860B"/>
-                <w:sz w:val="19"/>
-              </w:rPr>
-              <w:t>• Salary sacrifice instead — discounted where a personal deductible contribution better suits your circumstances.</w:t>
+                <w:sz w:val="19"/>
+              </w:rPr>
+              <w:t>• Salary sacrifice via your employer — equivalent outcome but requires an employer arrangement; non-concessional contribution — discounted as it gives no deduction.</w:t>
             </w:r>
           </w:p>
         </w:tc>
@@ -20832,9 +21803,13 @@
               <w:rPr>
                 <w:sz w:val="19"/>
               </w:rPr>
+              <w:t>• downsizer</w:t>
+              <w:br/>
               <w:t>• downsizer contribution</w:t>
               <w:br/>
-              <w:t>• downsizer</w:t>
+              <w:t>• sold home</w:t>
+              <w:br/>
+              <w:t>• sale of home proceeds</w:t>
             </w:r>
           </w:p>
         </w:tc>
@@ -20956,10 +21931,9 @@
           <w:p>
             <w:r>
               <w:rPr>
-                <w:color w:val="B8860B"/>
-                <w:sz w:val="19"/>
-              </w:rPr>
-              <w:t>We recommend you make a downsizer contribution of up to $300,000 each ($600,000 combined) to superannuation from the proceeds of selling your home.</w:t>
+                <w:sz w:val="19"/>
+              </w:rPr>
+              <w:t>We recommend you utilise the downsizer contribution strategy to make a one-off contribution of up to $300,000 each ($600,000 per couple) to your new superannuation account from the proceeds of the sale of your home.</w:t>
             </w:r>
           </w:p>
         </w:tc>
@@ -20988,10 +21962,9 @@
           <w:p>
             <w:r>
               <w:rPr>
-                <w:color w:val="B8860B"/>
-                <w:sz w:val="19"/>
-              </w:rPr>
-              <w:t>A downsizer contribution moves home-sale proceeds into the low-tax super environment without using your contribution caps.</w:t>
+                <w:sz w:val="19"/>
+              </w:rPr>
+              <w:t>The proceeds of your home sale are moved into the concessionally-taxed superannuation environment and used to fund a tax-free retirement income stream.</w:t>
             </w:r>
           </w:p>
         </w:tc>
@@ -21020,12 +21993,11 @@
           <w:p>
             <w:r>
               <w:rPr>
-                <w:color w:val="B8860B"/>
-                <w:sz w:val="19"/>
-              </w:rPr>
-              <w:t>• A downsizer contribution does not count toward your concessional or non-concessional caps and is not subject to the work test.</w:t>
+                <w:sz w:val="19"/>
+              </w:rPr>
+              <w:t>• The downsizer contribution lets you move up to $300,000 each from the sale of a main residence (owned 10+ years, age 55+) into super, regardless of your other contribution caps or total super balance.</w:t>
               <w:br/>
-              <w:t>• Allows you to boost retirement savings from the proceeds of selling your home.</w:t>
+              <w:t>• It allows the proceeds to be professionally managed in line with your risk profile and drawn as tax-free retirement income.</w:t>
             </w:r>
           </w:p>
         </w:tc>
@@ -21054,10 +22026,13 @@
           <w:p>
             <w:r>
               <w:rPr>
-                <w:color w:val="B8860B"/>
-                <w:sz w:val="19"/>
-              </w:rPr>
-              <w:t>• You must be age 55 or older, have owned the home for at least 10 years, and make the contribution within 90 days of settlement; the amount counts toward your transfer balance cap and is preserved.</w:t>
+                <w:sz w:val="19"/>
+              </w:rPr>
+              <w:t>• There is the normal risk of markets falling and unforeseen circumstances requiring you to draw funds when markets are down.</w:t>
+              <w:br/>
+              <w:t>• By investing your cash into a superannuation fund instead of a bank account you lose capital stability and a known rate of return. You also lose access to the government guarantee on deposits up to $250,000.</w:t>
+              <w:br/>
+              <w:t>• Funds are preserved — you cannot access them until you meet a condition of release.</w:t>
             </w:r>
           </w:p>
         </w:tc>
@@ -21086,10 +22061,11 @@
           <w:p>
             <w:r>
               <w:rPr>
-                <w:color w:val="B8860B"/>
-                <w:sz w:val="19"/>
-              </w:rPr>
-              <w:t>• Retain the proceeds outside super — discounted where the concessional super environment better meets your retirement goal.</w:t>
+                <w:sz w:val="19"/>
+              </w:rPr>
+              <w:t>• Retain the proceeds in cash/term deposits — discounted as it forgoes the tax-effective superannuation environment and professional management.</w:t>
+              <w:br/>
+              <w:t>• Contribute via non-concessional contributions instead — discounted where the downsizer rules allow a larger contribution without using your NCC caps.</w:t>
             </w:r>
           </w:p>
         </w:tc>
@@ -31452,7 +32428,9 @@
               <w:br/>
               <w:t>• spending plan</w:t>
               <w:br/>
-              <w:t>• cashflow management</w:t>
+              <w:t>• cashflow tracking</w:t>
+              <w:br/>
+              <w:t>• automated budgeting</w:t>
             </w:r>
           </w:p>
         </w:tc>
@@ -31574,10 +32552,9 @@
           <w:p>
             <w:r>
               <w:rPr>
-                <w:color w:val="B8860B"/>
-                <w:sz w:val="19"/>
-              </w:rPr>
-              <w:t>We recommend you adopt the budget set out in this advice and use the My Wealth Portal to track your income and expenses against it.</w:t>
+                <w:sz w:val="19"/>
+              </w:rPr>
+              <w:t>We recommend you use the automated budgeting system within the My Wealth Portal to track your spending and align your cashflow with your goals (and, in retirement, your pension drawdowns).</w:t>
             </w:r>
           </w:p>
         </w:tc>
@@ -31606,10 +32583,9 @@
           <w:p>
             <w:r>
               <w:rPr>
-                <w:color w:val="B8860B"/>
-                <w:sz w:val="19"/>
-              </w:rPr>
-              <w:t>A clear budget keeps your plan on track and ensures surplus is directed to your goals.</w:t>
+                <w:sz w:val="19"/>
+              </w:rPr>
+              <w:t>You gain clarity over spending and keep your cashflow aligned to your plan using the portal's automated budgeting tools.</w:t>
             </w:r>
           </w:p>
         </w:tc>
@@ -31638,10 +32614,9 @@
           <w:p>
             <w:r>
               <w:rPr>
-                <w:color w:val="B8860B"/>
-                <w:sz w:val="19"/>
-              </w:rPr>
-              <w:t>• The My Wealth Portal allows you to build personalised cash flow targets and goals which keep you accountable over time.</w:t>
+                <w:sz w:val="19"/>
+              </w:rPr>
+              <w:t>• The My Wealth Portal's automated budgeting provides the clarity to take control of your cashflow and ensure spending stays aligned with your income and goals.</w:t>
             </w:r>
           </w:p>
         </w:tc>
@@ -31670,10 +32645,9 @@
           <w:p>
             <w:r>
               <w:rPr>
-                <w:color w:val="B8860B"/>
-                <w:sz w:val="19"/>
-              </w:rPr>
-              <w:t>• (administrative strategy — no material risks)</w:t>
+                <w:sz w:val="19"/>
+              </w:rPr>
+              <w:t>• The tool supports but does not replace disciplined spending decisions.</w:t>
             </w:r>
           </w:p>
         </w:tc>
@@ -31702,9 +32676,9 @@
           <w:p>
             <w:r>
               <w:rPr>
-                <w:color w:val="B8860B"/>
-                <w:sz w:val="19"/>
-              </w:rPr>
+                <w:sz w:val="19"/>
+              </w:rPr>
+              <w:t>• Manual budgeting/spreadsheet tracking — discounted as it is more effort and less consistent than the automated portal.</w:t>
             </w:r>
           </w:p>
         </w:tc>

</xml_diff>